<commit_message>
Updated errata lists for piece 1 and 9.
</commit_message>
<xml_diff>
--- a/Working Folder/[Sent] 1 Xie Xiang Ming 谢湘铭 - A Stroll in the Lion City 狮城漫步/1 Xie Xiang Ming 谢湘铭 - A Stroll in the Lion City 狮城漫步 - Errata_v1.docx
+++ b/Working Folder/[Sent] 1 Xie Xiang Ming 谢湘铭 - A Stroll in the Lion City 狮城漫步/1 Xie Xiang Ming 谢湘铭 - A Stroll in the Lion City 狮城漫步 - Errata_v1.docx
@@ -6,7 +6,7 @@
       <w:pPr>
         <w:jc w:val="center"/>
         <w:rPr>
-          <w:rFonts w:ascii="PingFang TC" w:eastAsia="PingFang TC" w:hAnsi="PingFang TC" w:cs="PingFang TC"/>
+          <w:rFonts w:ascii="Times New Roman" w:eastAsia="PingFang TC" w:hAnsi="Times New Roman" w:cs="Times New Roman"/>
           <w:sz w:val="40"/>
           <w:szCs w:val="40"/>
           <w:lang w:val="en-US"/>
@@ -14,7 +14,7 @@
       </w:pPr>
       <w:r>
         <w:rPr>
-          <w:rFonts w:ascii="Times" w:eastAsia="Times" w:hAnsi="Times" w:cs="Times" w:hint="eastAsia"/>
+          <w:rFonts w:ascii="Times New Roman" w:eastAsia="Times" w:hAnsi="Times New Roman" w:cs="Times New Roman"/>
           <w:sz w:val="40"/>
           <w:szCs w:val="40"/>
         </w:rPr>
@@ -22,7 +22,7 @@
       </w:r>
       <w:r>
         <w:rPr>
-          <w:rFonts w:ascii="PingFang TC" w:eastAsia="PingFang TC" w:hAnsi="PingFang TC" w:cs="PingFang TC" w:hint="eastAsia"/>
+          <w:rFonts w:ascii="Times New Roman" w:eastAsia="PingFang TC" w:hAnsi="Times New Roman" w:cs="Times New Roman"/>
           <w:sz w:val="40"/>
           <w:szCs w:val="40"/>
         </w:rPr>
@@ -30,7 +30,7 @@
       </w:r>
       <w:r>
         <w:rPr>
-          <w:rFonts w:ascii="MS Mincho" w:eastAsia="MS Mincho" w:hAnsi="MS Mincho" w:cs="MS Mincho" w:hint="eastAsia"/>
+          <w:rFonts w:ascii="Times New Roman" w:eastAsia="MS Mincho" w:hAnsi="Times New Roman" w:cs="Times New Roman"/>
           <w:sz w:val="40"/>
           <w:szCs w:val="40"/>
         </w:rPr>
@@ -38,7 +38,7 @@
       </w:r>
       <w:r>
         <w:rPr>
-          <w:rFonts w:ascii="PingFang TC" w:eastAsia="PingFang TC" w:hAnsi="PingFang TC" w:cs="PingFang TC" w:hint="eastAsia"/>
+          <w:rFonts w:ascii="Times New Roman" w:eastAsia="PingFang TC" w:hAnsi="Times New Roman" w:cs="Times New Roman"/>
           <w:sz w:val="40"/>
           <w:szCs w:val="40"/>
         </w:rPr>
@@ -49,7 +49,7 @@
       <w:pPr>
         <w:jc w:val="center"/>
         <w:rPr>
-          <w:rFonts w:ascii="MS Mincho" w:eastAsia="MS Mincho" w:hAnsi="MS Mincho" w:cs="MS Mincho"/>
+          <w:rFonts w:ascii="Times New Roman" w:eastAsia="MS Mincho" w:hAnsi="Times New Roman" w:cs="Times New Roman"/>
           <w:sz w:val="40"/>
           <w:szCs w:val="40"/>
           <w:lang w:val="en-US"/>
@@ -57,7 +57,7 @@
       </w:pPr>
       <w:r>
         <w:rPr>
-          <w:rFonts w:ascii="Times" w:eastAsia="Times" w:hAnsi="Times" w:cs="Times" w:hint="eastAsia"/>
+          <w:rFonts w:ascii="Times New Roman" w:eastAsia="Times" w:hAnsi="Times New Roman" w:cs="Times New Roman"/>
           <w:sz w:val="40"/>
           <w:szCs w:val="40"/>
         </w:rPr>
@@ -65,7 +65,7 @@
       </w:r>
       <w:r>
         <w:rPr>
-          <w:rFonts w:ascii="PingFang TC" w:eastAsia="PingFang TC" w:hAnsi="PingFang TC" w:cs="PingFang TC" w:hint="eastAsia"/>
+          <w:rFonts w:ascii="Times New Roman" w:eastAsia="PingFang TC" w:hAnsi="Times New Roman" w:cs="Times New Roman"/>
           <w:sz w:val="40"/>
           <w:szCs w:val="40"/>
         </w:rPr>
@@ -73,7 +73,7 @@
       </w:r>
       <w:r>
         <w:rPr>
-          <w:rFonts w:ascii="MS Mincho" w:eastAsia="MS Mincho" w:hAnsi="MS Mincho" w:cs="MS Mincho" w:hint="eastAsia"/>
+          <w:rFonts w:ascii="Times New Roman" w:eastAsia="MS Mincho" w:hAnsi="Times New Roman" w:cs="Times New Roman"/>
           <w:sz w:val="40"/>
           <w:szCs w:val="40"/>
         </w:rPr>
@@ -84,7 +84,7 @@
       <w:pPr>
         <w:jc w:val="center"/>
         <w:rPr>
-          <w:rFonts w:ascii="Times" w:eastAsia="Times" w:hAnsi="Times" w:cs="Times"/>
+          <w:rFonts w:ascii="Times New Roman" w:eastAsia="Times" w:hAnsi="Times New Roman" w:cs="Times New Roman"/>
           <w:b/>
           <w:sz w:val="32"/>
           <w:szCs w:val="32"/>
@@ -92,7 +92,7 @@
       </w:pPr>
       <w:r>
         <w:rPr>
-          <w:rFonts w:ascii="Times" w:eastAsia="Times" w:hAnsi="Times" w:cs="Times"/>
+          <w:rFonts w:ascii="Times New Roman" w:eastAsia="Times" w:hAnsi="Times New Roman" w:cs="Times New Roman"/>
           <w:b/>
           <w:sz w:val="32"/>
           <w:szCs w:val="32"/>
@@ -103,7 +103,7 @@
     <w:p>
       <w:pPr>
         <w:rPr>
-          <w:rFonts w:ascii="Times" w:eastAsia="Times" w:hAnsi="Times" w:cs="Times"/>
+          <w:rFonts w:ascii="Times New Roman" w:eastAsia="Times" w:hAnsi="Times New Roman" w:cs="Times New Roman"/>
           <w:bCs/>
           <w:sz w:val="32"/>
           <w:szCs w:val="32"/>
@@ -115,7 +115,7 @@
         <w:ind w:left="720"/>
         <w:jc w:val="both"/>
         <w:rPr>
-          <w:rFonts w:ascii="SimSun" w:hAnsi="SimSun" w:cs="SimSun"/>
+          <w:rFonts w:ascii="Times New Roman" w:hAnsi="Times New Roman" w:cs="Times New Roman"/>
           <w:bCs/>
           <w:sz w:val="32"/>
           <w:szCs w:val="32"/>
@@ -123,7 +123,7 @@
       </w:pPr>
       <w:r>
         <w:rPr>
-          <w:rFonts w:ascii="Times" w:eastAsia="Times" w:hAnsi="Times" w:cs="Times"/>
+          <w:rFonts w:ascii="Times New Roman" w:eastAsia="Times" w:hAnsi="Times New Roman" w:cs="Times New Roman"/>
           <w:bCs/>
           <w:sz w:val="32"/>
           <w:szCs w:val="32"/>
@@ -132,7 +132,7 @@
       </w:r>
       <w:r>
         <w:rPr>
-          <w:rFonts w:ascii="Times" w:eastAsia="Times" w:hAnsi="Times" w:cs="Times"/>
+          <w:rFonts w:ascii="Times New Roman" w:eastAsia="Times" w:hAnsi="Times New Roman" w:cs="Times New Roman"/>
           <w:bCs/>
           <w:sz w:val="32"/>
           <w:szCs w:val="32"/>
@@ -141,7 +141,7 @@
       </w:r>
       <w:r>
         <w:rPr>
-          <w:rFonts w:ascii="Times" w:eastAsia="Times" w:hAnsi="Times" w:cs="Times"/>
+          <w:rFonts w:ascii="Times New Roman" w:eastAsia="Times" w:hAnsi="Times New Roman" w:cs="Times New Roman"/>
           <w:bCs/>
           <w:sz w:val="32"/>
           <w:szCs w:val="32"/>
@@ -150,7 +150,7 @@
       </w:r>
       <w:r>
         <w:rPr>
-          <w:rFonts w:ascii="Times" w:eastAsia="Times" w:hAnsi="Times" w:cs="Times"/>
+          <w:rFonts w:ascii="Times New Roman" w:eastAsia="Times" w:hAnsi="Times New Roman" w:cs="Times New Roman"/>
           <w:bCs/>
           <w:sz w:val="32"/>
           <w:szCs w:val="32"/>
@@ -159,7 +159,7 @@
       </w:r>
       <w:r>
         <w:rPr>
-          <w:rFonts w:ascii="Times" w:eastAsia="Times" w:hAnsi="Times" w:cs="Times"/>
+          <w:rFonts w:ascii="Times New Roman" w:eastAsia="Times" w:hAnsi="Times New Roman" w:cs="Times New Roman"/>
           <w:bCs/>
           <w:color w:val="FF40FF"/>
           <w:sz w:val="32"/>
@@ -169,7 +169,7 @@
       </w:r>
       <w:r>
         <w:rPr>
-          <w:rFonts w:ascii="Times" w:eastAsia="Times" w:hAnsi="Times" w:cs="Times"/>
+          <w:rFonts w:ascii="Times New Roman" w:eastAsia="Times" w:hAnsi="Times New Roman" w:cs="Times New Roman"/>
           <w:bCs/>
           <w:sz w:val="32"/>
           <w:szCs w:val="32"/>
@@ -178,7 +178,7 @@
       </w:r>
       <w:r>
         <w:rPr>
-          <w:rFonts w:ascii="SimSun" w:hAnsi="SimSun" w:cs="SimSun" w:hint="eastAsia"/>
+          <w:rFonts w:ascii="Times New Roman" w:hAnsi="Times New Roman" w:cs="Times New Roman"/>
           <w:bCs/>
           <w:sz w:val="32"/>
           <w:szCs w:val="32"/>
@@ -187,7 +187,7 @@
       </w:r>
       <w:r>
         <w:rPr>
-          <w:rFonts w:ascii="SimSun" w:hAnsi="SimSun" w:cs="SimSun" w:hint="eastAsia"/>
+          <w:rFonts w:ascii="Times New Roman" w:hAnsi="Times New Roman" w:cs="Times New Roman"/>
           <w:bCs/>
           <w:color w:val="FF66CC"/>
           <w:sz w:val="32"/>
@@ -197,7 +197,7 @@
       </w:r>
       <w:r>
         <w:rPr>
-          <w:rFonts w:ascii="SimSun" w:hAnsi="SimSun" w:cs="SimSun" w:hint="eastAsia"/>
+          <w:rFonts w:ascii="Times New Roman" w:hAnsi="Times New Roman" w:cs="Times New Roman"/>
           <w:bCs/>
           <w:sz w:val="32"/>
           <w:szCs w:val="32"/>
@@ -210,7 +210,7 @@
         <w:ind w:left="720"/>
         <w:jc w:val="both"/>
         <w:rPr>
-          <w:rFonts w:ascii="SimSun" w:hAnsi="SimSun" w:cs="SimSun"/>
+          <w:rFonts w:ascii="Times New Roman" w:hAnsi="Times New Roman" w:cs="Times New Roman"/>
           <w:bCs/>
           <w:sz w:val="32"/>
           <w:szCs w:val="32"/>
@@ -219,10 +219,9 @@
     </w:p>
     <w:p>
       <w:pPr>
-        <w:ind w:left="720"/>
         <w:jc w:val="both"/>
         <w:rPr>
-          <w:rFonts w:ascii="Times" w:eastAsia="Times" w:hAnsi="Times" w:cs="Times"/>
+          <w:rFonts w:ascii="Times New Roman" w:eastAsia="Times" w:hAnsi="Times New Roman" w:cs="Times New Roman"/>
           <w:bCs/>
           <w:sz w:val="32"/>
           <w:szCs w:val="32"/>
@@ -230,7 +229,7 @@
       </w:pPr>
       <w:r>
         <w:rPr>
-          <w:rFonts w:ascii="Times" w:eastAsia="Times" w:hAnsi="Times" w:cs="Times"/>
+          <w:rFonts w:ascii="Times New Roman" w:eastAsia="Times" w:hAnsi="Times New Roman" w:cs="Times New Roman"/>
           <w:bCs/>
           <w:sz w:val="32"/>
           <w:szCs w:val="32"/>
@@ -240,10 +239,9 @@
     </w:p>
     <w:p>
       <w:pPr>
-        <w:ind w:left="720"/>
         <w:jc w:val="both"/>
         <w:rPr>
-          <w:rFonts w:ascii="Times" w:eastAsia="Times" w:hAnsi="Times" w:cs="Times"/>
+          <w:rFonts w:ascii="Times New Roman" w:eastAsia="Times" w:hAnsi="Times New Roman" w:cs="Times New Roman"/>
           <w:bCs/>
           <w:sz w:val="32"/>
           <w:szCs w:val="32"/>
@@ -252,6 +250,11 @@
     </w:p>
     <w:p>
       <w:pPr>
+        <w:pStyle w:val="ListParagraph"/>
+        <w:numPr>
+          <w:ilvl w:val="0"/>
+          <w:numId w:val="8"/>
+        </w:numPr>
         <w:shd w:val="clear" w:color="auto" w:fill="FFFFFF"/>
         <w:rPr>
           <w:rFonts w:ascii="Times New Roman" w:eastAsia="Times New Roman" w:hAnsi="Times New Roman" w:cs="Times New Roman"/>
@@ -265,11 +268,16 @@
           <w:color w:val="222222"/>
           <w:lang w:val="en-US" w:eastAsia="en-US"/>
         </w:rPr>
-        <w:t>1. Pipa: Delete notes at bar 196-198</w:t>
+        <w:t>Pipa: Delete notes at bar 196-198</w:t>
       </w:r>
     </w:p>
     <w:p>
       <w:pPr>
+        <w:pStyle w:val="ListParagraph"/>
+        <w:numPr>
+          <w:ilvl w:val="0"/>
+          <w:numId w:val="8"/>
+        </w:numPr>
         <w:shd w:val="clear" w:color="auto" w:fill="FFFFFF"/>
         <w:rPr>
           <w:rFonts w:ascii="Times New Roman" w:eastAsia="Times New Roman" w:hAnsi="Times New Roman" w:cs="Times New Roman"/>
@@ -283,72 +291,80 @@
           <w:color w:val="222222"/>
           <w:lang w:val="en-US" w:eastAsia="en-US"/>
         </w:rPr>
-        <w:t> </w:t>
-      </w:r>
-    </w:p>
-    <w:p>
-      <w:pPr>
-        <w:shd w:val="clear" w:color="auto" w:fill="FFFFFF"/>
-        <w:rPr>
-          <w:rFonts w:ascii="Times New Roman" w:eastAsiaTheme="minorEastAsia" w:hAnsi="Times New Roman" w:cs="Times New Roman"/>
+        <w:t>Plucked strings, cello, double bass, Bangu </w:t>
+      </w:r>
+      <w:r>
+        <w:rPr>
+          <w:rFonts w:ascii="Times New Roman" w:eastAsia="DengXian" w:hAnsi="Times New Roman" w:cs="Times New Roman"/>
           <w:color w:val="222222"/>
           <w:lang w:val="en-US"/>
         </w:rPr>
-      </w:pPr>
+        <w:t>板鼓</w:t>
+      </w:r>
       <w:r>
         <w:rPr>
           <w:rFonts w:ascii="Times New Roman" w:eastAsia="Times New Roman" w:hAnsi="Times New Roman" w:cs="Times New Roman"/>
           <w:color w:val="222222"/>
           <w:lang w:val="en-US" w:eastAsia="en-US"/>
         </w:rPr>
-        <w:t>2. Plucked strings, cello, double bass, Bangu </w:t>
-      </w:r>
-      <w:r>
-        <w:rPr>
-          <w:rFonts w:ascii="DengXian" w:eastAsia="DengXian" w:hAnsi="DengXian" w:cs="Times New Roman" w:hint="eastAsia"/>
-          <w:color w:val="222222"/>
-          <w:lang w:val="en-US"/>
-        </w:rPr>
-        <w:t>板鼓</w:t>
-      </w:r>
+        <w:t xml:space="preserve">, </w:t>
+      </w:r>
+      <w:proofErr w:type="spellStart"/>
       <w:r>
         <w:rPr>
           <w:rFonts w:ascii="Times New Roman" w:eastAsia="Times New Roman" w:hAnsi="Times New Roman" w:cs="Times New Roman"/>
           <w:color w:val="222222"/>
           <w:lang w:val="en-US" w:eastAsia="en-US"/>
         </w:rPr>
-        <w:t>, Xiaotanggu </w:t>
-      </w:r>
-      <w:r>
-        <w:rPr>
-          <w:rFonts w:ascii="DengXian" w:eastAsia="DengXian" w:hAnsi="DengXian" w:cs="Times New Roman" w:hint="eastAsia"/>
-          <w:color w:val="222222"/>
-          <w:lang w:val="en-US"/>
-        </w:rPr>
-        <w:t>小堂鼓</w:t>
-      </w:r>
+        <w:t>Xiaotanggu</w:t>
+      </w:r>
+      <w:proofErr w:type="spellEnd"/>
       <w:r>
         <w:rPr>
           <w:rFonts w:ascii="Times New Roman" w:eastAsia="Times New Roman" w:hAnsi="Times New Roman" w:cs="Times New Roman"/>
           <w:color w:val="222222"/>
           <w:lang w:val="en-US" w:eastAsia="en-US"/>
         </w:rPr>
-        <w:t>: Delete the notes from third last bar</w:t>
-      </w:r>
-      <w:r>
-        <w:rPr>
-          <w:rFonts w:ascii="SimSun" w:hAnsi="SimSun" w:cs="SimSun"/>
+        <w:t> </w:t>
+      </w:r>
+      <w:r>
+        <w:rPr>
+          <w:rFonts w:ascii="Times New Roman" w:eastAsia="DengXian" w:hAnsi="Times New Roman" w:cs="Times New Roman"/>
           <w:color w:val="222222"/>
           <w:lang w:val="en-US"/>
         </w:rPr>
+        <w:t>小堂鼓</w:t>
+      </w:r>
+      <w:r>
+        <w:rPr>
+          <w:rFonts w:ascii="Times New Roman" w:eastAsia="Times New Roman" w:hAnsi="Times New Roman" w:cs="Times New Roman"/>
+          <w:color w:val="222222"/>
+          <w:lang w:val="en-US" w:eastAsia="en-US"/>
+        </w:rPr>
+        <w:t>: Delete the notes from third last bar</w:t>
+      </w:r>
+      <w:r>
+        <w:rPr>
+          <w:rFonts w:ascii="Times New Roman" w:hAnsi="Times New Roman" w:cs="Times New Roman"/>
+          <w:color w:val="222222"/>
+          <w:lang w:val="en-US"/>
+        </w:rPr>
         <w:t>.</w:t>
+      </w:r>
+      <w:r>
+        <w:rPr>
+          <w:rFonts w:ascii="Times New Roman" w:hAnsi="Times New Roman" w:cs="Times New Roman"/>
+          <w:color w:val="222222"/>
+          <w:lang w:val="en-US"/>
+        </w:rPr>
+        <w:t xml:space="preserve"> </w:t>
       </w:r>
     </w:p>
     <w:p>
       <w:pPr>
         <w:jc w:val="both"/>
         <w:rPr>
-          <w:rFonts w:ascii="SimSun" w:hAnsi="SimSun" w:cs="SimSun"/>
+          <w:rFonts w:ascii="Times New Roman" w:hAnsi="Times New Roman" w:cs="Times New Roman"/>
           <w:bCs/>
           <w:sz w:val="32"/>
           <w:szCs w:val="32"/>
@@ -359,22 +375,107 @@
       <w:pPr>
         <w:jc w:val="both"/>
         <w:rPr>
-          <w:rFonts w:ascii="SimSun" w:hAnsi="SimSun" w:cs="SimSun"/>
+          <w:rFonts w:ascii="Times New Roman" w:hAnsi="Times New Roman" w:cs="Times New Roman"/>
           <w:bCs/>
           <w:sz w:val="32"/>
           <w:szCs w:val="32"/>
         </w:rPr>
       </w:pPr>
-    </w:p>
-    <w:p>
-      <w:pPr>
-        <w:ind w:left="720"/>
-        <w:jc w:val="both"/>
-        <w:rPr>
-          <w:rFonts w:ascii="SimSun" w:hAnsi="SimSun" w:cs="SimSun"/>
+      <w:r>
+        <w:rPr>
+          <w:rFonts w:ascii="Times New Roman" w:hAnsi="Times New Roman" w:cs="Times New Roman"/>
           <w:bCs/>
           <w:sz w:val="32"/>
           <w:szCs w:val="32"/>
+        </w:rPr>
+        <w:t xml:space="preserve">Changes made by engraver: </w:t>
+      </w:r>
+    </w:p>
+    <w:p>
+      <w:pPr>
+        <w:jc w:val="both"/>
+        <w:rPr>
+          <w:rFonts w:ascii="Times New Roman" w:eastAsia="Times" w:hAnsi="Times New Roman" w:cs="Times New Roman"/>
+          <w:bCs/>
+          <w:sz w:val="32"/>
+          <w:szCs w:val="32"/>
+        </w:rPr>
+      </w:pPr>
+    </w:p>
+    <w:p>
+      <w:pPr>
+        <w:pStyle w:val="ListParagraph"/>
+        <w:numPr>
+          <w:ilvl w:val="0"/>
+          <w:numId w:val="7"/>
+        </w:numPr>
+        <w:shd w:val="clear" w:color="auto" w:fill="FFFFFF"/>
+        <w:rPr>
+          <w:rFonts w:ascii="Times New Roman" w:eastAsia="Times New Roman" w:hAnsi="Times New Roman" w:cs="Times New Roman"/>
+          <w:color w:val="222222"/>
+          <w:lang w:val="en-US" w:eastAsia="en-US"/>
+        </w:rPr>
+      </w:pPr>
+      <w:r>
+        <w:rPr>
+          <w:rFonts w:ascii="Times New Roman" w:eastAsia="Times New Roman" w:hAnsi="Times New Roman" w:cs="Times New Roman"/>
+          <w:color w:val="222222"/>
+          <w:lang w:val="en-US" w:eastAsia="en-US"/>
+        </w:rPr>
+        <w:t xml:space="preserve">Timpani and percussion. </w:t>
+      </w:r>
+      <w:r>
+        <w:rPr>
+          <w:rFonts w:ascii="Times New Roman" w:eastAsia="Times New Roman" w:hAnsi="Times New Roman" w:cs="Times New Roman"/>
+          <w:color w:val="222222"/>
+          <w:lang w:val="en-US" w:eastAsia="en-US"/>
+        </w:rPr>
+        <w:t>Timpani was assigned Perc. 1. Change instrument listing to just Timp. All percussion player numbers moved up by 1.</w:t>
+      </w:r>
+    </w:p>
+    <w:p>
+      <w:pPr>
+        <w:pStyle w:val="ListParagraph"/>
+        <w:numPr>
+          <w:ilvl w:val="0"/>
+          <w:numId w:val="7"/>
+        </w:numPr>
+        <w:shd w:val="clear" w:color="auto" w:fill="FFFFFF"/>
+        <w:rPr>
+          <w:rFonts w:ascii="Times New Roman" w:eastAsia="Times New Roman" w:hAnsi="Times New Roman" w:cs="Times New Roman"/>
+          <w:color w:val="222222"/>
+          <w:lang w:val="en-US" w:eastAsia="en-US"/>
+        </w:rPr>
+      </w:pPr>
+      <w:r>
+        <w:rPr>
+          <w:rFonts w:ascii="Times New Roman" w:eastAsia="Times" w:hAnsi="Times New Roman" w:cs="Times New Roman"/>
+        </w:rPr>
+        <w:t>Changed Zhongruan clef to treble-octave-down</w:t>
+      </w:r>
+      <w:r>
+        <w:rPr>
+          <w:rFonts w:ascii="Times New Roman" w:eastAsia="Times" w:hAnsi="Times New Roman" w:cs="Times New Roman"/>
+        </w:rPr>
+        <w:t xml:space="preserve"> clef</w:t>
+      </w:r>
+      <w:r>
+        <w:rPr>
+          <w:rFonts w:ascii="Times New Roman" w:eastAsia="Times" w:hAnsi="Times New Roman" w:cs="Times New Roman"/>
+        </w:rPr>
+        <w:t>.</w:t>
+      </w:r>
+    </w:p>
+    <w:p>
+      <w:pPr>
+        <w:ind w:left="720"/>
+        <w:jc w:val="both"/>
+        <w:rPr>
+          <w:rFonts w:ascii="Times New Roman" w:hAnsi="Times New Roman" w:cs="Times New Roman"/>
+          <w:bCs/>
+          <w:sz w:val="32"/>
+          <w:szCs w:val="32"/>
+          <w:lang w:val="en-US"/>
         </w:rPr>
       </w:pPr>
     </w:p>
@@ -411,14 +512,14 @@
             <w:pPr>
               <w:jc w:val="center"/>
               <w:rPr>
-                <w:rFonts w:ascii="Times" w:eastAsia="Times" w:hAnsi="Times" w:cs="Times"/>
+                <w:rFonts w:ascii="Times New Roman" w:eastAsia="Times" w:hAnsi="Times New Roman" w:cs="Times New Roman"/>
                 <w:b/>
                 <w:iCs/>
               </w:rPr>
             </w:pPr>
             <w:r>
               <w:rPr>
-                <w:rFonts w:ascii="Times" w:eastAsia="Times" w:hAnsi="Times" w:cs="Times"/>
+                <w:rFonts w:ascii="Times New Roman" w:eastAsia="Times" w:hAnsi="Times New Roman" w:cs="Times New Roman"/>
                 <w:b/>
                 <w:iCs/>
               </w:rPr>
@@ -426,7 +527,7 @@
             </w:r>
             <w:r>
               <w:rPr>
-                <w:rFonts w:ascii="Times" w:eastAsia="Times" w:hAnsi="Times" w:cs="Times"/>
+                <w:rFonts w:ascii="Times New Roman" w:eastAsia="Times" w:hAnsi="Times New Roman" w:cs="Times New Roman"/>
                 <w:b/>
                 <w:iCs/>
               </w:rPr>
@@ -447,13 +548,13 @@
             <w:pPr>
               <w:jc w:val="center"/>
               <w:rPr>
-                <w:rFonts w:ascii="Times" w:eastAsia="Times" w:hAnsi="Times" w:cs="Times"/>
+                <w:rFonts w:ascii="Times New Roman" w:eastAsia="Times" w:hAnsi="Times New Roman" w:cs="Times New Roman"/>
                 <w:b/>
               </w:rPr>
             </w:pPr>
             <w:r>
               <w:rPr>
-                <w:rFonts w:ascii="Times" w:eastAsia="Times" w:hAnsi="Times" w:cs="Times"/>
+                <w:rFonts w:ascii="Times New Roman" w:eastAsia="Times" w:hAnsi="Times New Roman" w:cs="Times New Roman"/>
                 <w:b/>
               </w:rPr>
               <w:t>Bar</w:t>
@@ -463,13 +564,13 @@
             <w:pPr>
               <w:jc w:val="center"/>
               <w:rPr>
-                <w:rFonts w:ascii="Times" w:eastAsia="Times" w:hAnsi="Times" w:cs="Times"/>
+                <w:rFonts w:ascii="Times New Roman" w:eastAsia="Times" w:hAnsi="Times New Roman" w:cs="Times New Roman"/>
                 <w:b/>
               </w:rPr>
             </w:pPr>
             <w:r>
               <w:rPr>
-                <w:rFonts w:ascii="SimSun" w:hAnsi="SimSun" w:cs="SimSun" w:hint="eastAsia"/>
+                <w:rFonts w:ascii="Times New Roman" w:hAnsi="Times New Roman" w:cs="Times New Roman"/>
                 <w:b/>
               </w:rPr>
               <w:t>小节</w:t>
@@ -484,13 +585,13 @@
             <w:pPr>
               <w:jc w:val="center"/>
               <w:rPr>
-                <w:rFonts w:ascii="Times" w:eastAsia="Times" w:hAnsi="Times" w:cs="Times"/>
+                <w:rFonts w:ascii="Times New Roman" w:eastAsia="Times" w:hAnsi="Times New Roman" w:cs="Times New Roman"/>
                 <w:b/>
               </w:rPr>
             </w:pPr>
             <w:r>
               <w:rPr>
-                <w:rFonts w:ascii="Times" w:eastAsia="Times" w:hAnsi="Times" w:cs="Times"/>
+                <w:rFonts w:ascii="Times New Roman" w:eastAsia="Times" w:hAnsi="Times New Roman" w:cs="Times New Roman"/>
                 <w:b/>
               </w:rPr>
               <w:t>Instrument</w:t>
@@ -500,13 +601,13 @@
             <w:pPr>
               <w:jc w:val="center"/>
               <w:rPr>
-                <w:rFonts w:ascii="Times" w:eastAsia="Times" w:hAnsi="Times" w:cs="Times"/>
+                <w:rFonts w:ascii="Times New Roman" w:eastAsia="Times" w:hAnsi="Times New Roman" w:cs="Times New Roman"/>
                 <w:b/>
               </w:rPr>
             </w:pPr>
             <w:r>
               <w:rPr>
-                <w:rFonts w:ascii="SimSun" w:hAnsi="SimSun" w:cs="SimSun" w:hint="eastAsia"/>
+                <w:rFonts w:ascii="Times New Roman" w:hAnsi="Times New Roman" w:cs="Times New Roman"/>
                 <w:b/>
               </w:rPr>
               <w:t>乐器</w:t>
@@ -521,13 +622,13 @@
             <w:pPr>
               <w:jc w:val="center"/>
               <w:rPr>
-                <w:rFonts w:ascii="Times" w:eastAsia="Times" w:hAnsi="Times" w:cs="Times"/>
+                <w:rFonts w:ascii="Times New Roman" w:eastAsia="Times" w:hAnsi="Times New Roman" w:cs="Times New Roman"/>
                 <w:b/>
               </w:rPr>
             </w:pPr>
             <w:r>
               <w:rPr>
-                <w:rFonts w:ascii="Times" w:eastAsia="Times" w:hAnsi="Times" w:cs="Times"/>
+                <w:rFonts w:ascii="Times New Roman" w:eastAsia="Times" w:hAnsi="Times New Roman" w:cs="Times New Roman"/>
                 <w:b/>
               </w:rPr>
               <w:t>Issue</w:t>
@@ -537,13 +638,13 @@
             <w:pPr>
               <w:jc w:val="center"/>
               <w:rPr>
-                <w:rFonts w:ascii="Times" w:eastAsia="Times" w:hAnsi="Times" w:cs="Times"/>
+                <w:rFonts w:ascii="Times New Roman" w:eastAsia="Times" w:hAnsi="Times New Roman" w:cs="Times New Roman"/>
                 <w:b/>
               </w:rPr>
             </w:pPr>
             <w:r>
               <w:rPr>
-                <w:rFonts w:ascii="SimSun" w:hAnsi="SimSun" w:cs="SimSun" w:hint="eastAsia"/>
+                <w:rFonts w:ascii="Times New Roman" w:hAnsi="Times New Roman" w:cs="Times New Roman"/>
                 <w:b/>
               </w:rPr>
               <w:t>问题</w:t>
@@ -558,13 +659,13 @@
             <w:pPr>
               <w:jc w:val="center"/>
               <w:rPr>
-                <w:rFonts w:ascii="Times" w:eastAsia="Times" w:hAnsi="Times" w:cs="Times"/>
+                <w:rFonts w:ascii="Times New Roman" w:eastAsia="Times" w:hAnsi="Times New Roman" w:cs="Times New Roman"/>
                 <w:b/>
               </w:rPr>
             </w:pPr>
             <w:r>
               <w:rPr>
-                <w:rFonts w:ascii="Times" w:eastAsia="Times" w:hAnsi="Times" w:cs="Times"/>
+                <w:rFonts w:ascii="Times New Roman" w:eastAsia="Times" w:hAnsi="Times New Roman" w:cs="Times New Roman"/>
                 <w:b/>
               </w:rPr>
               <w:t>Answer</w:t>
@@ -574,13 +675,13 @@
             <w:pPr>
               <w:jc w:val="center"/>
               <w:rPr>
-                <w:rFonts w:ascii="Times" w:eastAsia="Times" w:hAnsi="Times" w:cs="Times"/>
+                <w:rFonts w:ascii="Times New Roman" w:eastAsia="Times" w:hAnsi="Times New Roman" w:cs="Times New Roman"/>
                 <w:b/>
               </w:rPr>
             </w:pPr>
             <w:r>
               <w:rPr>
-                <w:rFonts w:ascii="SimSun" w:hAnsi="SimSun" w:cs="SimSun" w:hint="eastAsia"/>
+                <w:rFonts w:ascii="Times New Roman" w:hAnsi="Times New Roman" w:cs="Times New Roman"/>
                 <w:b/>
               </w:rPr>
               <w:t>答案</w:t>
@@ -600,14 +701,14 @@
             <w:pPr>
               <w:jc w:val="center"/>
               <w:rPr>
-                <w:rFonts w:ascii="Times" w:eastAsiaTheme="minorEastAsia" w:hAnsi="Times" w:cs="Times"/>
-              </w:rPr>
-            </w:pPr>
-            <w:r>
-              <w:rPr>
-                <w:rFonts w:ascii="Times" w:eastAsiaTheme="minorEastAsia" w:hAnsi="Times" w:cs="Times" w:hint="eastAsia"/>
-              </w:rPr>
-              <w:t>Applies to whole score</w:t>
+                <w:rFonts w:ascii="Times New Roman" w:eastAsiaTheme="minorEastAsia" w:hAnsi="Times New Roman" w:cs="Times New Roman"/>
+              </w:rPr>
+            </w:pPr>
+            <w:r>
+              <w:rPr>
+                <w:rFonts w:ascii="Times New Roman" w:eastAsiaTheme="minorEastAsia" w:hAnsi="Times New Roman" w:cs="Times New Roman"/>
+              </w:rPr>
+              <w:t>51</w:t>
             </w:r>
           </w:p>
         </w:tc>
@@ -619,21 +720,17 @@
             <w:pPr>
               <w:jc w:val="center"/>
               <w:rPr>
-                <w:rFonts w:ascii="Times" w:eastAsiaTheme="minorEastAsia" w:hAnsi="Times" w:cs="Times"/>
-              </w:rPr>
-            </w:pPr>
-            <w:r>
-              <w:rPr>
-                <w:rFonts w:ascii="Times" w:eastAsiaTheme="minorEastAsia" w:hAnsi="Times" w:cs="Times" w:hint="eastAsia"/>
-              </w:rPr>
-              <w:t>P</w:t>
-            </w:r>
-            <w:r>
-              <w:rPr>
-                <w:rFonts w:ascii="Times" w:eastAsiaTheme="minorEastAsia" w:hAnsi="Times" w:cs="Times" w:hint="eastAsia"/>
-              </w:rPr>
-              <w:t>ercussion</w:t>
-            </w:r>
+                <w:rFonts w:ascii="Times New Roman" w:eastAsiaTheme="minorEastAsia" w:hAnsi="Times New Roman" w:cs="Times New Roman"/>
+              </w:rPr>
+            </w:pPr>
+            <w:proofErr w:type="spellStart"/>
+            <w:r>
+              <w:rPr>
+                <w:rFonts w:ascii="Times New Roman" w:eastAsiaTheme="minorEastAsia" w:hAnsi="Times New Roman" w:cs="Times New Roman"/>
+              </w:rPr>
+              <w:t>Bangdi</w:t>
+            </w:r>
+            <w:proofErr w:type="spellEnd"/>
           </w:p>
         </w:tc>
         <w:tc>
@@ -643,32 +740,28 @@
           <w:p>
             <w:pPr>
               <w:rPr>
-                <w:rFonts w:ascii="Times" w:eastAsiaTheme="minorEastAsia" w:hAnsi="Times" w:cs="Times"/>
-              </w:rPr>
-            </w:pPr>
-            <w:r>
-              <w:rPr>
-                <w:rFonts w:ascii="Times" w:eastAsiaTheme="minorEastAsia" w:hAnsi="Times" w:cs="Times" w:hint="eastAsia"/>
-              </w:rPr>
-              <w:t xml:space="preserve">Should </w:t>
-            </w:r>
-            <w:r>
-              <w:rPr>
-                <w:rFonts w:ascii="Times" w:eastAsiaTheme="minorEastAsia" w:hAnsi="Times" w:cs="Times"/>
-              </w:rPr>
-              <w:t>tremolo</w:t>
-            </w:r>
-            <w:r>
-              <w:rPr>
-                <w:rFonts w:ascii="Times" w:eastAsiaTheme="minorEastAsia" w:hAnsi="Times" w:cs="Times" w:hint="eastAsia"/>
-              </w:rPr>
-              <w:t xml:space="preserve"> rolls across bars be tied or not tied? </w:t>
-            </w:r>
-            <w:r>
-              <w:rPr>
-                <w:rFonts w:ascii="Times" w:eastAsiaTheme="minorEastAsia" w:hAnsi="Times" w:cs="Times" w:hint="eastAsia"/>
-              </w:rPr>
-              <w:t xml:space="preserve">Both occur at various points of the piece. </w:t>
+                <w:rFonts w:ascii="Times New Roman" w:eastAsiaTheme="minorEastAsia" w:hAnsi="Times New Roman" w:cs="Times New Roman"/>
+              </w:rPr>
+            </w:pPr>
+            <w:r>
+              <w:rPr>
+                <w:rFonts w:ascii="Times New Roman" w:eastAsiaTheme="minorEastAsia" w:hAnsi="Times New Roman" w:cs="Times New Roman"/>
+              </w:rPr>
+              <w:t>Where does the crescendo end?</w:t>
+            </w:r>
+          </w:p>
+          <w:p>
+            <w:pPr>
+              <w:rPr>
+                <w:rFonts w:ascii="SimSun" w:hAnsi="SimSun" w:cs="Times New Roman"/>
+                <w:lang w:val="en-GB"/>
+              </w:rPr>
+            </w:pPr>
+            <w:r>
+              <w:rPr>
+                <w:rFonts w:ascii="SimSun" w:hAnsi="SimSun" w:cs="Times New Roman"/>
+              </w:rPr>
+              <w:t>渐强在哪里结束？</w:t>
             </w:r>
           </w:p>
         </w:tc>
@@ -681,7 +774,7 @@
             <w:pPr>
               <w:jc w:val="center"/>
               <w:rPr>
-                <w:rFonts w:ascii="Times" w:eastAsia="Times" w:hAnsi="Times" w:cs="Times"/>
+                <w:rFonts w:ascii="Times New Roman" w:eastAsia="Times" w:hAnsi="Times New Roman" w:cs="Times New Roman"/>
                 <w:color w:val="FF0000"/>
               </w:rPr>
             </w:pPr>
@@ -700,14 +793,20 @@
             <w:pPr>
               <w:jc w:val="center"/>
               <w:rPr>
-                <w:rFonts w:ascii="Times" w:eastAsia="Times" w:hAnsi="Times" w:cs="Times"/>
-              </w:rPr>
-            </w:pPr>
-            <w:r>
-              <w:rPr>
-                <w:rFonts w:ascii="Times" w:eastAsia="Times" w:hAnsi="Times" w:cs="Times"/>
-              </w:rPr>
-              <w:t>1</w:t>
+                <w:rFonts w:ascii="Times New Roman" w:eastAsia="Times" w:hAnsi="Times New Roman" w:cs="Times New Roman"/>
+              </w:rPr>
+            </w:pPr>
+            <w:r>
+              <w:rPr>
+                <w:rFonts w:ascii="Times New Roman" w:eastAsia="Times" w:hAnsi="Times New Roman" w:cs="Times New Roman"/>
+              </w:rPr>
+              <w:t>70</w:t>
+            </w:r>
+            <w:r>
+              <w:rPr>
+                <w:rFonts w:ascii="Times New Roman" w:eastAsia="Times" w:hAnsi="Times New Roman" w:cs="Times New Roman"/>
+              </w:rPr>
+              <w:t>-76</w:t>
             </w:r>
           </w:p>
         </w:tc>
@@ -719,15 +818,31 @@
             <w:pPr>
               <w:jc w:val="center"/>
               <w:rPr>
-                <w:rFonts w:ascii="Times" w:eastAsia="Times" w:hAnsi="Times" w:cs="Times"/>
-              </w:rPr>
-            </w:pPr>
-            <w:r>
-              <w:rPr>
-                <w:rFonts w:ascii="Times" w:eastAsia="Times" w:hAnsi="Times" w:cs="Times"/>
-              </w:rPr>
-              <w:t>Timpani and Percussion</w:t>
-            </w:r>
+                <w:rFonts w:ascii="Times New Roman" w:eastAsia="Times" w:hAnsi="Times New Roman" w:cs="Times New Roman"/>
+              </w:rPr>
+            </w:pPr>
+            <w:proofErr w:type="spellStart"/>
+            <w:r>
+              <w:rPr>
+                <w:rFonts w:ascii="Times New Roman" w:eastAsia="Times" w:hAnsi="Times New Roman" w:cs="Times New Roman"/>
+              </w:rPr>
+              <w:t>GYSh</w:t>
+            </w:r>
+            <w:proofErr w:type="spellEnd"/>
+            <w:r>
+              <w:rPr>
+                <w:rFonts w:ascii="Times New Roman" w:eastAsia="Times" w:hAnsi="Times New Roman" w:cs="Times New Roman"/>
+              </w:rPr>
+              <w:t xml:space="preserve">, </w:t>
+            </w:r>
+            <w:proofErr w:type="spellStart"/>
+            <w:r>
+              <w:rPr>
+                <w:rFonts w:ascii="Times New Roman" w:eastAsia="Times" w:hAnsi="Times New Roman" w:cs="Times New Roman"/>
+              </w:rPr>
+              <w:t>ZYSh</w:t>
+            </w:r>
+            <w:proofErr w:type="spellEnd"/>
           </w:p>
         </w:tc>
         <w:tc>
@@ -737,15 +852,65 @@
           <w:p>
             <w:pPr>
               <w:rPr>
-                <w:rFonts w:ascii="Times" w:eastAsia="Times" w:hAnsi="Times" w:cs="Times"/>
-              </w:rPr>
-            </w:pPr>
-            <w:r>
-              <w:rPr>
-                <w:rFonts w:ascii="Times" w:eastAsia="Times" w:hAnsi="Times" w:cs="Times"/>
-              </w:rPr>
-              <w:t>Timpani was assigned Perc. 1. Change instrument listing to just Timp. All percussion player numbers moved up by 1.</w:t>
-            </w:r>
+                <w:rFonts w:ascii="Times New Roman" w:eastAsia="Times" w:hAnsi="Times New Roman" w:cs="Times New Roman"/>
+              </w:rPr>
+            </w:pPr>
+            <w:r>
+              <w:rPr>
+                <w:rFonts w:ascii="Times New Roman" w:eastAsia="Times" w:hAnsi="Times New Roman" w:cs="Times New Roman"/>
+              </w:rPr>
+              <w:t>Is there supposed to be a2 in this part</w:t>
+            </w:r>
+            <w:r>
+              <w:rPr>
+                <w:rFonts w:ascii="Times New Roman" w:eastAsia="Times" w:hAnsi="Times New Roman" w:cs="Times New Roman"/>
+              </w:rPr>
+              <w:t>?</w:t>
+            </w:r>
+          </w:p>
+          <w:p>
+            <w:pPr>
+              <w:rPr>
+                <w:rFonts w:ascii="Times New Roman" w:eastAsia="Times" w:hAnsi="Times New Roman" w:cs="Times New Roman"/>
+              </w:rPr>
+            </w:pPr>
+            <w:r>
+              <w:rPr>
+                <w:rFonts w:ascii="Times New Roman" w:eastAsia="Times" w:hAnsi="Times New Roman" w:cs="Times New Roman"/>
+              </w:rPr>
+              <w:t xml:space="preserve"> </w:t>
+            </w:r>
+            <w:r>
+              <w:rPr>
+                <w:rFonts w:ascii="Times New Roman" w:hAnsi="Times New Roman" w:cs="Times New Roman"/>
+              </w:rPr>
+              <w:t>这部分应该有</w:t>
+            </w:r>
+            <w:r>
+              <w:rPr>
+                <w:rFonts w:ascii="Times New Roman" w:eastAsia="Times" w:hAnsi="Times New Roman" w:cs="Times New Roman"/>
+              </w:rPr>
+              <w:t xml:space="preserve"> a2 </w:t>
+            </w:r>
+            <w:r>
+              <w:rPr>
+                <w:rFonts w:ascii="Times New Roman" w:hAnsi="Times New Roman" w:cs="Times New Roman"/>
+              </w:rPr>
+              <w:t>吗</w:t>
+            </w:r>
+            <w:r>
+              <w:rPr>
+                <w:rFonts w:ascii="Times New Roman" w:hAnsi="Times New Roman" w:cs="Times New Roman"/>
+              </w:rPr>
+              <w:t>？</w:t>
+            </w:r>
+          </w:p>
+          <w:p>
+            <w:pPr>
+              <w:rPr>
+                <w:rFonts w:ascii="Times New Roman" w:eastAsia="Times" w:hAnsi="Times New Roman" w:cs="Times New Roman"/>
+              </w:rPr>
+            </w:pPr>
           </w:p>
         </w:tc>
         <w:tc>
@@ -757,7 +922,7 @@
             <w:pPr>
               <w:jc w:val="center"/>
               <w:rPr>
-                <w:rFonts w:ascii="Times" w:eastAsia="Times" w:hAnsi="Times" w:cs="Times"/>
+                <w:rFonts w:ascii="Times New Roman" w:eastAsia="Times" w:hAnsi="Times New Roman" w:cs="Times New Roman"/>
                 <w:color w:val="FF0000"/>
               </w:rPr>
             </w:pPr>
@@ -776,14 +941,14 @@
             <w:pPr>
               <w:jc w:val="center"/>
               <w:rPr>
-                <w:rFonts w:ascii="Times" w:eastAsia="Times" w:hAnsi="Times" w:cs="Times"/>
-              </w:rPr>
-            </w:pPr>
-            <w:r>
-              <w:rPr>
-                <w:rFonts w:ascii="Times" w:eastAsia="Times" w:hAnsi="Times" w:cs="Times"/>
-              </w:rPr>
-              <w:t>1</w:t>
+                <w:rFonts w:ascii="Times New Roman" w:eastAsia="Times" w:hAnsi="Times New Roman" w:cs="Times New Roman"/>
+              </w:rPr>
+            </w:pPr>
+            <w:r>
+              <w:rPr>
+                <w:rFonts w:ascii="Times New Roman" w:eastAsia="Times" w:hAnsi="Times New Roman" w:cs="Times New Roman"/>
+              </w:rPr>
+              <w:t>134</w:t>
             </w:r>
           </w:p>
         </w:tc>
@@ -795,14 +960,14 @@
             <w:pPr>
               <w:jc w:val="center"/>
               <w:rPr>
-                <w:rFonts w:ascii="Times" w:eastAsia="Times" w:hAnsi="Times" w:cs="Times"/>
-              </w:rPr>
-            </w:pPr>
-            <w:r>
-              <w:rPr>
-                <w:rFonts w:ascii="Times" w:eastAsia="Times" w:hAnsi="Times" w:cs="Times"/>
-              </w:rPr>
-              <w:t>Zhongruan</w:t>
+                <w:rFonts w:ascii="Times New Roman" w:eastAsia="Times" w:hAnsi="Times New Roman" w:cs="Times New Roman"/>
+              </w:rPr>
+            </w:pPr>
+            <w:r>
+              <w:rPr>
+                <w:rFonts w:ascii="Times New Roman" w:eastAsia="Times" w:hAnsi="Times New Roman" w:cs="Times New Roman"/>
+              </w:rPr>
+              <w:t>Timpani</w:t>
             </w:r>
           </w:p>
         </w:tc>
@@ -813,14 +978,30 @@
           <w:p>
             <w:pPr>
               <w:rPr>
-                <w:rFonts w:ascii="Times" w:eastAsia="Times" w:hAnsi="Times" w:cs="Times"/>
-              </w:rPr>
-            </w:pPr>
-            <w:r>
-              <w:rPr>
-                <w:rFonts w:ascii="Times" w:eastAsia="Times" w:hAnsi="Times" w:cs="Times"/>
-              </w:rPr>
-              <w:t>Changed Zhongruan clef to treble instead of treble-octave-down</w:t>
+                <w:rFonts w:ascii="Times New Roman" w:eastAsia="Times" w:hAnsi="Times New Roman" w:cs="Times New Roman"/>
+              </w:rPr>
+            </w:pPr>
+            <w:r>
+              <w:rPr>
+                <w:rFonts w:ascii="Times New Roman" w:eastAsia="Times" w:hAnsi="Times New Roman" w:cs="Times New Roman"/>
+              </w:rPr>
+              <w:t xml:space="preserve">Missing </w:t>
+            </w:r>
+            <w:r>
+              <w:rPr>
+                <w:rFonts w:ascii="Times New Roman" w:eastAsia="Times" w:hAnsi="Times New Roman" w:cs="Times New Roman"/>
+                <w:b/>
+                <w:bCs/>
+                <w:i/>
+                <w:iCs/>
+              </w:rPr>
+              <w:t xml:space="preserve">f </w:t>
+            </w:r>
+            <w:r>
+              <w:rPr>
+                <w:rFonts w:ascii="Times New Roman" w:eastAsia="Times" w:hAnsi="Times New Roman" w:cs="Times New Roman"/>
+              </w:rPr>
+              <w:t>?</w:t>
             </w:r>
           </w:p>
         </w:tc>
@@ -833,7 +1014,7 @@
             <w:pPr>
               <w:jc w:val="center"/>
               <w:rPr>
-                <w:rFonts w:ascii="Times" w:eastAsia="Times" w:hAnsi="Times" w:cs="Times"/>
+                <w:rFonts w:ascii="Times New Roman" w:hAnsi="Times New Roman" w:cs="Times New Roman"/>
                 <w:color w:val="FF0000"/>
               </w:rPr>
             </w:pPr>
@@ -852,14 +1033,14 @@
             <w:pPr>
               <w:jc w:val="center"/>
               <w:rPr>
-                <w:rFonts w:ascii="Times" w:eastAsiaTheme="minorEastAsia" w:hAnsi="Times" w:cs="Times"/>
-              </w:rPr>
-            </w:pPr>
-            <w:r>
-              <w:rPr>
-                <w:rFonts w:ascii="Times" w:eastAsiaTheme="minorEastAsia" w:hAnsi="Times" w:cs="Times" w:hint="eastAsia"/>
-              </w:rPr>
-              <w:t>51</w:t>
+                <w:rFonts w:ascii="Times New Roman" w:eastAsia="Times" w:hAnsi="Times New Roman" w:cs="Times New Roman"/>
+              </w:rPr>
+            </w:pPr>
+            <w:r>
+              <w:rPr>
+                <w:rFonts w:ascii="Times New Roman" w:eastAsia="Times" w:hAnsi="Times New Roman" w:cs="Times New Roman"/>
+              </w:rPr>
+              <w:t>135</w:t>
             </w:r>
           </w:p>
         </w:tc>
@@ -871,14 +1052,16 @@
             <w:pPr>
               <w:jc w:val="center"/>
               <w:rPr>
-                <w:rFonts w:ascii="Times" w:eastAsiaTheme="minorEastAsia" w:hAnsi="Times" w:cs="Times"/>
-              </w:rPr>
-            </w:pPr>
-            <w:r>
-              <w:rPr>
-                <w:rFonts w:ascii="Times" w:eastAsiaTheme="minorEastAsia" w:hAnsi="Times" w:cs="Times" w:hint="eastAsia"/>
-              </w:rPr>
-              <w:t>Bangdi</w:t>
+                <w:rFonts w:ascii="Times New Roman" w:eastAsia="Times" w:hAnsi="Times New Roman" w:cs="Times New Roman"/>
+                <w:lang w:val="en-US"/>
+              </w:rPr>
+            </w:pPr>
+            <w:r>
+              <w:rPr>
+                <w:rFonts w:ascii="Times New Roman" w:eastAsia="Times" w:hAnsi="Times New Roman" w:cs="Times New Roman"/>
+                <w:lang w:val="en-US"/>
+              </w:rPr>
+              <w:t>Perc II</w:t>
             </w:r>
           </w:p>
         </w:tc>
@@ -889,15 +1072,44 @@
           <w:p>
             <w:pPr>
               <w:rPr>
-                <w:rFonts w:ascii="Times" w:eastAsiaTheme="minorEastAsia" w:hAnsi="Times" w:cs="Times"/>
-                <w:lang w:val="en-GB"/>
-              </w:rPr>
-            </w:pPr>
-            <w:r>
-              <w:rPr>
-                <w:rFonts w:ascii="Times" w:eastAsiaTheme="minorEastAsia" w:hAnsi="Times" w:cs="Times" w:hint="eastAsia"/>
-              </w:rPr>
-              <w:t xml:space="preserve">Where does the crescendo end? </w:t>
+                <w:rFonts w:ascii="Times New Roman" w:eastAsia="Times" w:hAnsi="Times New Roman" w:cs="Times New Roman"/>
+              </w:rPr>
+            </w:pPr>
+            <w:r>
+              <w:rPr>
+                <w:rFonts w:ascii="Times New Roman" w:eastAsia="Times" w:hAnsi="Times New Roman" w:cs="Times New Roman"/>
+              </w:rPr>
+              <w:t>Missing</w:t>
+            </w:r>
+            <w:r>
+              <w:rPr>
+                <w:rFonts w:ascii="Times New Roman" w:eastAsia="Times" w:hAnsi="Times New Roman" w:cs="Times New Roman"/>
+              </w:rPr>
+              <w:t xml:space="preserve"> </w:t>
+            </w:r>
+            <w:r>
+              <w:rPr>
+                <w:rFonts w:ascii="Times New Roman" w:eastAsia="Times" w:hAnsi="Times New Roman" w:cs="Times New Roman"/>
+                <w:b/>
+                <w:bCs/>
+                <w:i/>
+                <w:iCs/>
+              </w:rPr>
+              <w:t>f</w:t>
+            </w:r>
+            <w:r>
+              <w:rPr>
+                <w:rFonts w:ascii="Times New Roman" w:eastAsia="Times" w:hAnsi="Times New Roman" w:cs="Times New Roman"/>
+                <w:i/>
+                <w:iCs/>
+              </w:rPr>
+              <w:t xml:space="preserve"> </w:t>
+            </w:r>
+            <w:r>
+              <w:rPr>
+                <w:rFonts w:ascii="Times New Roman" w:eastAsia="Times" w:hAnsi="Times New Roman" w:cs="Times New Roman"/>
+              </w:rPr>
+              <w:t>?</w:t>
             </w:r>
           </w:p>
         </w:tc>
@@ -910,7 +1122,7 @@
             <w:pPr>
               <w:jc w:val="center"/>
               <w:rPr>
-                <w:rFonts w:ascii="Times" w:eastAsia="Times" w:hAnsi="Times" w:cs="Times"/>
+                <w:rFonts w:ascii="Times New Roman" w:hAnsi="Times New Roman" w:cs="Times New Roman"/>
                 <w:color w:val="FF0000"/>
               </w:rPr>
             </w:pPr>
@@ -929,20 +1141,20 @@
             <w:pPr>
               <w:jc w:val="center"/>
               <w:rPr>
-                <w:rFonts w:ascii="Times" w:eastAsia="Times" w:hAnsi="Times" w:cs="Times"/>
-              </w:rPr>
-            </w:pPr>
-            <w:r>
-              <w:rPr>
-                <w:rFonts w:ascii="Times" w:eastAsia="Times" w:hAnsi="Times" w:cs="Times"/>
-              </w:rPr>
-              <w:t>70</w:t>
-            </w:r>
-            <w:r>
-              <w:rPr>
-                <w:rFonts w:ascii="Times" w:eastAsia="Times" w:hAnsi="Times" w:cs="Times"/>
-              </w:rPr>
-              <w:t>-76</w:t>
+                <w:rFonts w:ascii="Times New Roman" w:eastAsia="Times" w:hAnsi="Times New Roman" w:cs="Times New Roman"/>
+              </w:rPr>
+            </w:pPr>
+            <w:r>
+              <w:rPr>
+                <w:rFonts w:ascii="Times New Roman" w:eastAsia="Times" w:hAnsi="Times New Roman" w:cs="Times New Roman"/>
+              </w:rPr>
+              <w:t>191-</w:t>
+            </w:r>
+            <w:r>
+              <w:rPr>
+                <w:rFonts w:ascii="Times New Roman" w:eastAsia="Times" w:hAnsi="Times New Roman" w:cs="Times New Roman"/>
+              </w:rPr>
+              <w:t>192</w:t>
             </w:r>
           </w:p>
         </w:tc>
@@ -954,14 +1166,14 @@
             <w:pPr>
               <w:jc w:val="center"/>
               <w:rPr>
-                <w:rFonts w:ascii="Times" w:eastAsia="Times" w:hAnsi="Times" w:cs="Times"/>
-              </w:rPr>
-            </w:pPr>
-            <w:r>
-              <w:rPr>
-                <w:rFonts w:ascii="Times" w:eastAsia="Times" w:hAnsi="Times" w:cs="Times"/>
-              </w:rPr>
-              <w:t>GYSh, ZYSh</w:t>
+                <w:rFonts w:ascii="Times New Roman" w:eastAsia="Times" w:hAnsi="Times New Roman" w:cs="Times New Roman"/>
+              </w:rPr>
+            </w:pPr>
+            <w:r>
+              <w:rPr>
+                <w:rFonts w:ascii="Times New Roman" w:eastAsia="Times" w:hAnsi="Times New Roman" w:cs="Times New Roman"/>
+              </w:rPr>
+              <w:t>Guzheng</w:t>
             </w:r>
           </w:p>
         </w:tc>
@@ -972,15 +1184,95 @@
           <w:p>
             <w:pPr>
               <w:rPr>
-                <w:rFonts w:ascii="Times" w:eastAsia="Times" w:hAnsi="Times" w:cs="Times"/>
-              </w:rPr>
-            </w:pPr>
-            <w:r>
-              <w:rPr>
-                <w:rFonts w:ascii="Times" w:eastAsia="Times" w:hAnsi="Times" w:cs="Times"/>
-              </w:rPr>
-              <w:t xml:space="preserve">There are three notes in this chord, how should the 2 instruments play this? </w:t>
-            </w:r>
+                <w:rFonts w:ascii="Times New Roman" w:eastAsiaTheme="minorEastAsia" w:hAnsi="Times New Roman" w:cs="Times New Roman"/>
+              </w:rPr>
+            </w:pPr>
+            <w:r>
+              <w:rPr>
+                <w:rFonts w:ascii="Times New Roman" w:eastAsiaTheme="minorEastAsia" w:hAnsi="Times New Roman" w:cs="Times New Roman" w:hint="eastAsia"/>
+              </w:rPr>
+              <w:t>Is this c</w:t>
+            </w:r>
+            <w:r>
+              <w:rPr>
+                <w:rFonts w:ascii="Times New Roman" w:eastAsia="Times" w:hAnsi="Times New Roman" w:cs="Times New Roman"/>
+              </w:rPr>
+              <w:t xml:space="preserve">rescendo </w:t>
+            </w:r>
+            <w:r>
+              <w:rPr>
+                <w:rFonts w:ascii="Times New Roman" w:eastAsiaTheme="minorEastAsia" w:hAnsi="Times New Roman" w:cs="Times New Roman" w:hint="eastAsia"/>
+              </w:rPr>
+              <w:t xml:space="preserve">supposed to end in </w:t>
+            </w:r>
+            <w:r>
+              <w:rPr>
+                <w:rFonts w:ascii="Times New Roman" w:eastAsiaTheme="minorEastAsia" w:hAnsi="Times New Roman" w:cs="Times New Roman" w:hint="eastAsia"/>
+                <w:b/>
+                <w:bCs/>
+                <w:i/>
+                <w:iCs/>
+              </w:rPr>
+              <w:t>f</w:t>
+            </w:r>
+            <w:r>
+              <w:rPr>
+                <w:rFonts w:ascii="Times New Roman" w:eastAsiaTheme="minorEastAsia" w:hAnsi="Times New Roman" w:cs="Times New Roman" w:hint="eastAsia"/>
+              </w:rPr>
+              <w:t xml:space="preserve"> ?</w:t>
+            </w:r>
+          </w:p>
+          <w:p>
+            <w:pPr>
+              <w:rPr>
+                <w:rFonts w:ascii="Times New Roman" w:eastAsiaTheme="minorEastAsia" w:hAnsi="Times New Roman" w:cs="Times New Roman"/>
+              </w:rPr>
+            </w:pPr>
+            <w:r>
+              <w:rPr>
+                <w:rFonts w:ascii="Times New Roman" w:eastAsiaTheme="minorEastAsia" w:hAnsi="Times New Roman" w:cs="Times New Roman" w:hint="eastAsia"/>
+              </w:rPr>
+              <w:t>渐强音应该以</w:t>
+            </w:r>
+            <w:r>
+              <w:rPr>
+                <w:rFonts w:ascii="Times New Roman" w:eastAsiaTheme="minorEastAsia" w:hAnsi="Times New Roman" w:cs="Times New Roman" w:hint="eastAsia"/>
+              </w:rPr>
+              <w:t xml:space="preserve">  </w:t>
+            </w:r>
+            <w:r>
+              <w:rPr>
+                <w:rFonts w:ascii="Times New Roman" w:eastAsiaTheme="minorEastAsia" w:hAnsi="Times New Roman" w:cs="Times New Roman" w:hint="eastAsia"/>
+                <w:b/>
+                <w:bCs/>
+                <w:i/>
+                <w:iCs/>
+              </w:rPr>
+              <w:t>f</w:t>
+            </w:r>
+            <w:r>
+              <w:rPr>
+                <w:rFonts w:ascii="Times New Roman" w:eastAsiaTheme="minorEastAsia" w:hAnsi="Times New Roman" w:cs="Times New Roman" w:hint="eastAsia"/>
+                <w:b/>
+                <w:bCs/>
+                <w:i/>
+                <w:iCs/>
+              </w:rPr>
+              <w:t xml:space="preserve">  </w:t>
+            </w:r>
+            <w:r>
+              <w:rPr>
+                <w:rFonts w:ascii="Times New Roman" w:eastAsiaTheme="minorEastAsia" w:hAnsi="Times New Roman" w:cs="Times New Roman" w:hint="eastAsia"/>
+              </w:rPr>
+              <w:t>结束吗？</w:t>
+            </w:r>
+          </w:p>
+          <w:p>
+            <w:pPr>
+              <w:rPr>
+                <w:rFonts w:ascii="Times New Roman" w:eastAsiaTheme="minorEastAsia" w:hAnsi="Times New Roman" w:cs="Times New Roman" w:hint="eastAsia"/>
+              </w:rPr>
+            </w:pPr>
           </w:p>
         </w:tc>
         <w:tc>
@@ -992,7 +1284,7 @@
             <w:pPr>
               <w:jc w:val="center"/>
               <w:rPr>
-                <w:rFonts w:ascii="Times" w:eastAsia="Times" w:hAnsi="Times" w:cs="Times"/>
+                <w:rFonts w:ascii="Times New Roman" w:hAnsi="Times New Roman" w:cs="Times New Roman"/>
                 <w:color w:val="FF0000"/>
               </w:rPr>
             </w:pPr>
@@ -1011,14 +1303,14 @@
             <w:pPr>
               <w:jc w:val="center"/>
               <w:rPr>
-                <w:rFonts w:ascii="Times" w:eastAsia="Times" w:hAnsi="Times" w:cs="Times"/>
-              </w:rPr>
-            </w:pPr>
-            <w:r>
-              <w:rPr>
-                <w:rFonts w:ascii="Times" w:eastAsia="Times" w:hAnsi="Times" w:cs="Times"/>
-              </w:rPr>
-              <w:t>134</w:t>
+                <w:rFonts w:ascii="Times New Roman" w:eastAsia="Times" w:hAnsi="Times New Roman" w:cs="Times New Roman"/>
+              </w:rPr>
+            </w:pPr>
+            <w:r>
+              <w:rPr>
+                <w:rFonts w:ascii="Times New Roman" w:eastAsia="Times" w:hAnsi="Times New Roman" w:cs="Times New Roman"/>
+              </w:rPr>
+              <w:t>231</w:t>
             </w:r>
           </w:p>
         </w:tc>
@@ -1030,14 +1322,14 @@
             <w:pPr>
               <w:jc w:val="center"/>
               <w:rPr>
-                <w:rFonts w:ascii="Times" w:eastAsia="Times" w:hAnsi="Times" w:cs="Times"/>
-              </w:rPr>
-            </w:pPr>
-            <w:r>
-              <w:rPr>
-                <w:rFonts w:ascii="Times" w:eastAsia="Times" w:hAnsi="Times" w:cs="Times"/>
-              </w:rPr>
-              <w:t>Timpani</w:t>
+                <w:rFonts w:ascii="Times New Roman" w:eastAsia="Times" w:hAnsi="Times New Roman" w:cs="Times New Roman"/>
+              </w:rPr>
+            </w:pPr>
+            <w:r>
+              <w:rPr>
+                <w:rFonts w:ascii="Times New Roman" w:eastAsia="Times" w:hAnsi="Times New Roman" w:cs="Times New Roman"/>
+              </w:rPr>
+              <w:t>Perc IV</w:t>
             </w:r>
           </w:p>
         </w:tc>
@@ -1048,18 +1340,18 @@
           <w:p>
             <w:pPr>
               <w:rPr>
-                <w:rFonts w:ascii="Times" w:eastAsia="Times" w:hAnsi="Times" w:cs="Times"/>
-              </w:rPr>
-            </w:pPr>
-            <w:r>
-              <w:rPr>
-                <w:rFonts w:ascii="Times" w:eastAsia="Times" w:hAnsi="Times" w:cs="Times"/>
+                <w:rFonts w:ascii="Times New Roman" w:eastAsia="Times" w:hAnsi="Times New Roman" w:cs="Times New Roman"/>
+              </w:rPr>
+            </w:pPr>
+            <w:r>
+              <w:rPr>
+                <w:rFonts w:ascii="Times New Roman" w:eastAsia="Times" w:hAnsi="Times New Roman" w:cs="Times New Roman"/>
               </w:rPr>
               <w:t xml:space="preserve">Missing </w:t>
             </w:r>
             <w:r>
               <w:rPr>
-                <w:rFonts w:ascii="Times" w:eastAsia="Times" w:hAnsi="Times" w:cs="Times"/>
+                <w:rFonts w:ascii="Times New Roman" w:eastAsia="Times" w:hAnsi="Times New Roman" w:cs="Times New Roman"/>
                 <w:b/>
                 <w:bCs/>
                 <w:i/>
@@ -1069,19 +1361,9 @@
             </w:r>
             <w:r>
               <w:rPr>
-                <w:rFonts w:ascii="Times" w:eastAsia="Times" w:hAnsi="Times" w:cs="Times"/>
-                <w:b/>
-                <w:bCs/>
-                <w:i/>
-                <w:iCs/>
-              </w:rPr>
-              <w:t xml:space="preserve"> </w:t>
-            </w:r>
-            <w:r>
-              <w:rPr>
-                <w:rFonts w:ascii="Times" w:eastAsia="Times" w:hAnsi="Times" w:cs="Times"/>
-              </w:rPr>
-              <w:t>?</w:t>
+                <w:rFonts w:ascii="Times New Roman" w:eastAsia="Times" w:hAnsi="Times New Roman" w:cs="Times New Roman"/>
+              </w:rPr>
+              <w:t xml:space="preserve"> ?</w:t>
             </w:r>
           </w:p>
         </w:tc>
@@ -1113,14 +1395,14 @@
             <w:pPr>
               <w:jc w:val="center"/>
               <w:rPr>
-                <w:rFonts w:ascii="Times" w:eastAsia="Times" w:hAnsi="Times" w:cs="Times"/>
-              </w:rPr>
-            </w:pPr>
-            <w:r>
-              <w:rPr>
-                <w:rFonts w:ascii="Times" w:eastAsia="Times" w:hAnsi="Times" w:cs="Times"/>
-              </w:rPr>
-              <w:t>135</w:t>
+                <w:rFonts w:ascii="Times New Roman" w:eastAsia="Times" w:hAnsi="Times New Roman" w:cs="Times New Roman"/>
+              </w:rPr>
+            </w:pPr>
+            <w:r>
+              <w:rPr>
+                <w:rFonts w:ascii="Times New Roman" w:eastAsia="Times" w:hAnsi="Times New Roman" w:cs="Times New Roman"/>
+              </w:rPr>
+              <w:t>265</w:t>
             </w:r>
           </w:p>
         </w:tc>
@@ -1132,14 +1414,12 @@
             <w:pPr>
               <w:jc w:val="center"/>
               <w:rPr>
-                <w:rFonts w:ascii="Times" w:eastAsia="Times" w:hAnsi="Times" w:cs="Times"/>
-                <w:lang w:val="en-US"/>
-              </w:rPr>
-            </w:pPr>
-            <w:r>
-              <w:rPr>
-                <w:rFonts w:ascii="Times" w:eastAsia="Times" w:hAnsi="Times" w:cs="Times"/>
-                <w:lang w:val="en-US"/>
+                <w:rFonts w:ascii="Times New Roman" w:eastAsia="Times" w:hAnsi="Times New Roman" w:cs="Times New Roman"/>
+              </w:rPr>
+            </w:pPr>
+            <w:r>
+              <w:rPr>
+                <w:rFonts w:ascii="Times New Roman" w:eastAsia="Times" w:hAnsi="Times New Roman" w:cs="Times New Roman"/>
               </w:rPr>
               <w:t>Perc II</w:t>
             </w:r>
@@ -1152,44 +1432,30 @@
           <w:p>
             <w:pPr>
               <w:rPr>
-                <w:rFonts w:ascii="Times" w:eastAsia="Times" w:hAnsi="Times" w:cs="Times"/>
-              </w:rPr>
-            </w:pPr>
-            <w:r>
-              <w:rPr>
-                <w:rFonts w:ascii="Times" w:eastAsia="Times" w:hAnsi="Times" w:cs="Times"/>
-              </w:rPr>
-              <w:t>Missing</w:t>
-            </w:r>
-            <w:r>
-              <w:rPr>
-                <w:rFonts w:ascii="Times" w:eastAsia="Times" w:hAnsi="Times" w:cs="Times"/>
-              </w:rPr>
-              <w:t xml:space="preserve"> </w:t>
-            </w:r>
-            <w:r>
-              <w:rPr>
-                <w:rFonts w:ascii="Times" w:eastAsia="Times" w:hAnsi="Times" w:cs="Times"/>
+                <w:rFonts w:ascii="Times New Roman" w:eastAsia="Times" w:hAnsi="Times New Roman" w:cs="Times New Roman"/>
+              </w:rPr>
+            </w:pPr>
+            <w:r>
+              <w:rPr>
+                <w:rFonts w:ascii="Times New Roman" w:eastAsia="Times" w:hAnsi="Times New Roman" w:cs="Times New Roman"/>
+              </w:rPr>
+              <w:t xml:space="preserve">Missing </w:t>
+            </w:r>
+            <w:r>
+              <w:rPr>
+                <w:rFonts w:ascii="Times New Roman" w:eastAsia="Times" w:hAnsi="Times New Roman" w:cs="Times New Roman"/>
                 <w:b/>
                 <w:bCs/>
                 <w:i/>
                 <w:iCs/>
               </w:rPr>
-              <w:t>f</w:t>
-            </w:r>
-            <w:r>
-              <w:rPr>
-                <w:rFonts w:ascii="Times" w:eastAsia="Times" w:hAnsi="Times" w:cs="Times"/>
-                <w:i/>
-                <w:iCs/>
-              </w:rPr>
-              <w:t xml:space="preserve"> </w:t>
-            </w:r>
-            <w:r>
-              <w:rPr>
-                <w:rFonts w:ascii="Times" w:eastAsia="Times" w:hAnsi="Times" w:cs="Times"/>
-              </w:rPr>
-              <w:t>?</w:t>
+              <w:t>p</w:t>
+            </w:r>
+            <w:r>
+              <w:rPr>
+                <w:rFonts w:ascii="Times New Roman" w:eastAsia="Times" w:hAnsi="Times New Roman" w:cs="Times New Roman"/>
+              </w:rPr>
+              <w:t xml:space="preserve"> ?</w:t>
             </w:r>
           </w:p>
         </w:tc>
@@ -1221,21 +1487,9 @@
             <w:pPr>
               <w:jc w:val="center"/>
               <w:rPr>
-                <w:rFonts w:ascii="Times" w:eastAsia="Times" w:hAnsi="Times" w:cs="Times"/>
-              </w:rPr>
-            </w:pPr>
-            <w:r>
-              <w:rPr>
-                <w:rFonts w:ascii="Times" w:eastAsia="Times" w:hAnsi="Times" w:cs="Times"/>
-              </w:rPr>
-              <w:t>191-</w:t>
-            </w:r>
-            <w:r>
-              <w:rPr>
-                <w:rFonts w:ascii="Times" w:eastAsia="Times" w:hAnsi="Times" w:cs="Times"/>
-              </w:rPr>
-              <w:t>192</w:t>
-            </w:r>
+                <w:rFonts w:ascii="Times New Roman" w:eastAsia="Times" w:hAnsi="Times New Roman" w:cs="Times New Roman"/>
+              </w:rPr>
+            </w:pPr>
           </w:p>
         </w:tc>
         <w:tc>
@@ -1246,15 +1500,9 @@
             <w:pPr>
               <w:jc w:val="center"/>
               <w:rPr>
-                <w:rFonts w:ascii="Times" w:eastAsia="Times" w:hAnsi="Times" w:cs="Times"/>
-              </w:rPr>
-            </w:pPr>
-            <w:r>
-              <w:rPr>
-                <w:rFonts w:ascii="Times" w:eastAsia="Times" w:hAnsi="Times" w:cs="Times"/>
-              </w:rPr>
-              <w:t>Guzheng</w:t>
-            </w:r>
+                <w:rFonts w:ascii="Times New Roman" w:eastAsia="Times" w:hAnsi="Times New Roman" w:cs="Times New Roman"/>
+              </w:rPr>
+            </w:pPr>
           </w:p>
         </w:tc>
         <w:tc>
@@ -1264,15 +1512,9 @@
           <w:p>
             <w:pPr>
               <w:rPr>
-                <w:rFonts w:ascii="Times" w:eastAsia="Times" w:hAnsi="Times" w:cs="Times"/>
-              </w:rPr>
-            </w:pPr>
-            <w:r>
-              <w:rPr>
-                <w:rFonts w:ascii="Times" w:eastAsia="Times" w:hAnsi="Times" w:cs="Times"/>
-              </w:rPr>
-              <w:t>Suspect crescendo hairpin.</w:t>
-            </w:r>
+                <w:rFonts w:ascii="Times New Roman" w:eastAsia="Times" w:hAnsi="Times New Roman" w:cs="Times New Roman"/>
+              </w:rPr>
+            </w:pPr>
           </w:p>
         </w:tc>
         <w:tc>
@@ -1303,15 +1545,9 @@
             <w:pPr>
               <w:jc w:val="center"/>
               <w:rPr>
-                <w:rFonts w:ascii="Times" w:eastAsia="Times" w:hAnsi="Times" w:cs="Times"/>
-              </w:rPr>
-            </w:pPr>
-            <w:r>
-              <w:rPr>
-                <w:rFonts w:ascii="Times" w:eastAsia="Times" w:hAnsi="Times" w:cs="Times"/>
-              </w:rPr>
-              <w:t>231</w:t>
-            </w:r>
+                <w:rFonts w:ascii="Times New Roman" w:eastAsia="Times" w:hAnsi="Times New Roman" w:cs="Times New Roman"/>
+              </w:rPr>
+            </w:pPr>
           </w:p>
         </w:tc>
         <w:tc>
@@ -1322,15 +1558,9 @@
             <w:pPr>
               <w:jc w:val="center"/>
               <w:rPr>
-                <w:rFonts w:ascii="Times" w:eastAsia="Times" w:hAnsi="Times" w:cs="Times"/>
-              </w:rPr>
-            </w:pPr>
-            <w:r>
-              <w:rPr>
-                <w:rFonts w:ascii="Times" w:eastAsia="Times" w:hAnsi="Times" w:cs="Times"/>
-              </w:rPr>
-              <w:t>Perc IV</w:t>
-            </w:r>
+                <w:rFonts w:ascii="Times New Roman" w:eastAsia="Times" w:hAnsi="Times New Roman" w:cs="Times New Roman"/>
+              </w:rPr>
+            </w:pPr>
           </w:p>
         </w:tc>
         <w:tc>
@@ -1340,31 +1570,9 @@
           <w:p>
             <w:pPr>
               <w:rPr>
-                <w:rFonts w:ascii="Times" w:eastAsia="Times" w:hAnsi="Times" w:cs="Times"/>
-              </w:rPr>
-            </w:pPr>
-            <w:r>
-              <w:rPr>
-                <w:rFonts w:ascii="Times" w:eastAsia="Times" w:hAnsi="Times" w:cs="Times"/>
-              </w:rPr>
-              <w:t xml:space="preserve">Missing </w:t>
-            </w:r>
-            <w:r>
-              <w:rPr>
-                <w:rFonts w:ascii="Times" w:eastAsia="Times" w:hAnsi="Times" w:cs="Times"/>
-                <w:b/>
-                <w:bCs/>
-                <w:i/>
-                <w:iCs/>
-              </w:rPr>
-              <w:t>f</w:t>
-            </w:r>
-            <w:r>
-              <w:rPr>
-                <w:rFonts w:ascii="Times" w:eastAsia="Times" w:hAnsi="Times" w:cs="Times"/>
-              </w:rPr>
-              <w:t xml:space="preserve"> ?</w:t>
-            </w:r>
+                <w:rFonts w:ascii="Times New Roman" w:eastAsia="Times" w:hAnsi="Times New Roman" w:cs="Times New Roman"/>
+              </w:rPr>
+            </w:pPr>
           </w:p>
         </w:tc>
         <w:tc>
@@ -1395,16 +1603,9 @@
             <w:pPr>
               <w:jc w:val="center"/>
               <w:rPr>
-                <w:rFonts w:ascii="Times" w:eastAsia="Times" w:hAnsi="Times" w:cs="Times"/>
-              </w:rPr>
-            </w:pPr>
-            <w:r>
-              <w:rPr>
-                <w:rFonts w:ascii="Times" w:eastAsia="Times" w:hAnsi="Times" w:cs="Times"/>
-              </w:rPr>
-              <w:lastRenderedPageBreak/>
-              <w:t>265</w:t>
-            </w:r>
+                <w:rFonts w:ascii="Times New Roman" w:eastAsia="Times" w:hAnsi="Times New Roman" w:cs="Times New Roman"/>
+              </w:rPr>
+            </w:pPr>
           </w:p>
         </w:tc>
         <w:tc>
@@ -1415,15 +1616,10 @@
             <w:pPr>
               <w:jc w:val="center"/>
               <w:rPr>
-                <w:rFonts w:ascii="Times" w:eastAsia="Times" w:hAnsi="Times" w:cs="Times"/>
-              </w:rPr>
-            </w:pPr>
-            <w:r>
-              <w:rPr>
-                <w:rFonts w:ascii="Times" w:eastAsia="Times" w:hAnsi="Times" w:cs="Times"/>
-              </w:rPr>
-              <w:t>Perc II</w:t>
-            </w:r>
+                <w:rFonts w:ascii="Times New Roman" w:eastAsia="MS Mincho" w:hAnsi="Times New Roman" w:cs="Times New Roman"/>
+                <w:lang w:val="en-US"/>
+              </w:rPr>
+            </w:pPr>
           </w:p>
         </w:tc>
         <w:tc>
@@ -1433,31 +1629,9 @@
           <w:p>
             <w:pPr>
               <w:rPr>
-                <w:rFonts w:ascii="Times" w:eastAsia="Times" w:hAnsi="Times" w:cs="Times"/>
-              </w:rPr>
-            </w:pPr>
-            <w:r>
-              <w:rPr>
-                <w:rFonts w:ascii="Times" w:eastAsia="Times" w:hAnsi="Times" w:cs="Times"/>
-              </w:rPr>
-              <w:t xml:space="preserve">Missing </w:t>
-            </w:r>
-            <w:r>
-              <w:rPr>
-                <w:rFonts w:ascii="Times" w:eastAsia="Times" w:hAnsi="Times" w:cs="Times"/>
-                <w:b/>
-                <w:bCs/>
-                <w:i/>
-                <w:iCs/>
-              </w:rPr>
-              <w:t>p</w:t>
-            </w:r>
-            <w:r>
-              <w:rPr>
-                <w:rFonts w:ascii="Times" w:eastAsia="Times" w:hAnsi="Times" w:cs="Times"/>
-              </w:rPr>
-              <w:t xml:space="preserve"> ?</w:t>
-            </w:r>
+                <w:rFonts w:ascii="Times New Roman" w:eastAsia="Times" w:hAnsi="Times New Roman" w:cs="Times New Roman"/>
+              </w:rPr>
+            </w:pPr>
           </w:p>
         </w:tc>
         <w:tc>
@@ -1488,7 +1662,7 @@
             <w:pPr>
               <w:jc w:val="center"/>
               <w:rPr>
-                <w:rFonts w:ascii="Times" w:eastAsia="Times" w:hAnsi="Times" w:cs="Times"/>
+                <w:rFonts w:ascii="Times New Roman" w:eastAsia="Times" w:hAnsi="Times New Roman" w:cs="Times New Roman"/>
               </w:rPr>
             </w:pPr>
           </w:p>
@@ -1501,7 +1675,7 @@
             <w:pPr>
               <w:jc w:val="center"/>
               <w:rPr>
-                <w:rFonts w:ascii="Times" w:eastAsia="Times" w:hAnsi="Times" w:cs="Times"/>
+                <w:rFonts w:ascii="Times New Roman" w:eastAsia="Times" w:hAnsi="Times New Roman" w:cs="Times New Roman"/>
               </w:rPr>
             </w:pPr>
           </w:p>
@@ -1513,7 +1687,7 @@
           <w:p>
             <w:pPr>
               <w:rPr>
-                <w:rFonts w:ascii="Times" w:eastAsia="Times" w:hAnsi="Times" w:cs="Times"/>
+                <w:rFonts w:ascii="Times New Roman" w:eastAsia="Times" w:hAnsi="Times New Roman" w:cs="Times New Roman"/>
               </w:rPr>
             </w:pPr>
           </w:p>
@@ -1546,7 +1720,7 @@
             <w:pPr>
               <w:jc w:val="center"/>
               <w:rPr>
-                <w:rFonts w:ascii="Times" w:eastAsia="Times" w:hAnsi="Times" w:cs="Times"/>
+                <w:rFonts w:ascii="Times New Roman" w:eastAsia="Times" w:hAnsi="Times New Roman" w:cs="Times New Roman"/>
               </w:rPr>
             </w:pPr>
           </w:p>
@@ -1559,7 +1733,8 @@
             <w:pPr>
               <w:jc w:val="center"/>
               <w:rPr>
-                <w:rFonts w:ascii="Times" w:eastAsia="Times" w:hAnsi="Times" w:cs="Times"/>
+                <w:rFonts w:ascii="Times New Roman" w:eastAsia="MS Mincho" w:hAnsi="Times New Roman" w:cs="Times New Roman"/>
+                <w:lang w:val="en-US"/>
               </w:rPr>
             </w:pPr>
           </w:p>
@@ -1571,183 +1746,7 @@
           <w:p>
             <w:pPr>
               <w:rPr>
-                <w:rFonts w:ascii="Times" w:eastAsia="Times" w:hAnsi="Times" w:cs="Times"/>
-              </w:rPr>
-            </w:pPr>
-          </w:p>
-        </w:tc>
-        <w:tc>
-          <w:tcPr>
-            <w:tcW w:w="2711" w:type="dxa"/>
-            <w:vAlign w:val="center"/>
-          </w:tcPr>
-          <w:p>
-            <w:pPr>
-              <w:jc w:val="center"/>
-              <w:rPr>
-                <w:rFonts w:ascii="Times New Roman" w:hAnsi="Times New Roman" w:cs="Times New Roman"/>
-                <w:color w:val="FF0000"/>
-              </w:rPr>
-            </w:pPr>
-          </w:p>
-        </w:tc>
-      </w:tr>
-      <w:tr>
-        <w:trPr>
-          <w:trHeight w:val="552"/>
-        </w:trPr>
-        <w:tc>
-          <w:tcPr>
-            <w:tcW w:w="1129" w:type="dxa"/>
-          </w:tcPr>
-          <w:p>
-            <w:pPr>
-              <w:jc w:val="center"/>
-              <w:rPr>
-                <w:rFonts w:ascii="Times" w:eastAsia="Times" w:hAnsi="Times" w:cs="Times"/>
-              </w:rPr>
-            </w:pPr>
-          </w:p>
-        </w:tc>
-        <w:tc>
-          <w:tcPr>
-            <w:tcW w:w="1985" w:type="dxa"/>
-          </w:tcPr>
-          <w:p>
-            <w:pPr>
-              <w:jc w:val="center"/>
-              <w:rPr>
-                <w:rFonts w:ascii="MS Mincho" w:eastAsia="MS Mincho" w:hAnsi="MS Mincho" w:cs="MS Mincho"/>
-                <w:lang w:val="en-US"/>
-              </w:rPr>
-            </w:pPr>
-          </w:p>
-        </w:tc>
-        <w:tc>
-          <w:tcPr>
-            <w:tcW w:w="3260" w:type="dxa"/>
-          </w:tcPr>
-          <w:p>
-            <w:pPr>
-              <w:rPr>
-                <w:rFonts w:ascii="Times" w:eastAsia="Times" w:hAnsi="Times" w:cs="Times"/>
-              </w:rPr>
-            </w:pPr>
-          </w:p>
-        </w:tc>
-        <w:tc>
-          <w:tcPr>
-            <w:tcW w:w="2711" w:type="dxa"/>
-            <w:vAlign w:val="center"/>
-          </w:tcPr>
-          <w:p>
-            <w:pPr>
-              <w:jc w:val="center"/>
-              <w:rPr>
-                <w:rFonts w:ascii="Times New Roman" w:hAnsi="Times New Roman" w:cs="Times New Roman"/>
-                <w:color w:val="FF0000"/>
-              </w:rPr>
-            </w:pPr>
-          </w:p>
-        </w:tc>
-      </w:tr>
-      <w:tr>
-        <w:trPr>
-          <w:trHeight w:val="552"/>
-        </w:trPr>
-        <w:tc>
-          <w:tcPr>
-            <w:tcW w:w="1129" w:type="dxa"/>
-          </w:tcPr>
-          <w:p>
-            <w:pPr>
-              <w:jc w:val="center"/>
-              <w:rPr>
-                <w:rFonts w:ascii="Times" w:eastAsia="Times" w:hAnsi="Times" w:cs="Times"/>
-              </w:rPr>
-            </w:pPr>
-          </w:p>
-        </w:tc>
-        <w:tc>
-          <w:tcPr>
-            <w:tcW w:w="1985" w:type="dxa"/>
-          </w:tcPr>
-          <w:p>
-            <w:pPr>
-              <w:jc w:val="center"/>
-              <w:rPr>
-                <w:rFonts w:ascii="Times" w:eastAsia="Times" w:hAnsi="Times" w:cs="Times"/>
-              </w:rPr>
-            </w:pPr>
-          </w:p>
-        </w:tc>
-        <w:tc>
-          <w:tcPr>
-            <w:tcW w:w="3260" w:type="dxa"/>
-          </w:tcPr>
-          <w:p>
-            <w:pPr>
-              <w:rPr>
-                <w:rFonts w:ascii="Times" w:eastAsia="Times" w:hAnsi="Times" w:cs="Times"/>
-              </w:rPr>
-            </w:pPr>
-          </w:p>
-        </w:tc>
-        <w:tc>
-          <w:tcPr>
-            <w:tcW w:w="2711" w:type="dxa"/>
-            <w:vAlign w:val="center"/>
-          </w:tcPr>
-          <w:p>
-            <w:pPr>
-              <w:jc w:val="center"/>
-              <w:rPr>
-                <w:rFonts w:ascii="Times New Roman" w:hAnsi="Times New Roman" w:cs="Times New Roman"/>
-                <w:color w:val="FF0000"/>
-              </w:rPr>
-            </w:pPr>
-          </w:p>
-        </w:tc>
-      </w:tr>
-      <w:tr>
-        <w:trPr>
-          <w:trHeight w:val="552"/>
-        </w:trPr>
-        <w:tc>
-          <w:tcPr>
-            <w:tcW w:w="1129" w:type="dxa"/>
-          </w:tcPr>
-          <w:p>
-            <w:pPr>
-              <w:jc w:val="center"/>
-              <w:rPr>
-                <w:rFonts w:ascii="Times" w:eastAsia="Times" w:hAnsi="Times" w:cs="Times"/>
-              </w:rPr>
-            </w:pPr>
-          </w:p>
-        </w:tc>
-        <w:tc>
-          <w:tcPr>
-            <w:tcW w:w="1985" w:type="dxa"/>
-          </w:tcPr>
-          <w:p>
-            <w:pPr>
-              <w:jc w:val="center"/>
-              <w:rPr>
-                <w:rFonts w:ascii="MS Mincho" w:eastAsia="MS Mincho" w:hAnsi="MS Mincho" w:cs="MS Mincho"/>
-                <w:lang w:val="en-US"/>
-              </w:rPr>
-            </w:pPr>
-          </w:p>
-        </w:tc>
-        <w:tc>
-          <w:tcPr>
-            <w:tcW w:w="3260" w:type="dxa"/>
-          </w:tcPr>
-          <w:p>
-            <w:pPr>
-              <w:rPr>
-                <w:rFonts w:ascii="Times" w:eastAsia="Times" w:hAnsi="Times" w:cs="Times"/>
+                <w:rFonts w:ascii="Times New Roman" w:eastAsia="Times" w:hAnsi="Times New Roman" w:cs="Times New Roman"/>
               </w:rPr>
             </w:pPr>
           </w:p>
@@ -1774,7 +1773,7 @@
         <w:ind w:left="720"/>
         <w:jc w:val="both"/>
         <w:rPr>
-          <w:rFonts w:ascii="SimSun" w:hAnsi="SimSun" w:cs="SimSun"/>
+          <w:rFonts w:ascii="Times New Roman" w:hAnsi="Times New Roman" w:cs="Times New Roman"/>
           <w:bCs/>
           <w:sz w:val="32"/>
           <w:szCs w:val="32"/>
@@ -1786,7 +1785,7 @@
         <w:ind w:left="720"/>
         <w:jc w:val="both"/>
         <w:rPr>
-          <w:rFonts w:ascii="SimSun" w:hAnsi="SimSun" w:cs="SimSun"/>
+          <w:rFonts w:ascii="Times New Roman" w:hAnsi="Times New Roman" w:cs="Times New Roman"/>
           <w:bCs/>
           <w:sz w:val="32"/>
           <w:szCs w:val="32"/>
@@ -1798,7 +1797,7 @@
         <w:ind w:left="720"/>
         <w:jc w:val="both"/>
         <w:rPr>
-          <w:rFonts w:ascii="SimSun" w:hAnsi="SimSun" w:cs="SimSun"/>
+          <w:rFonts w:ascii="Times New Roman" w:hAnsi="Times New Roman" w:cs="Times New Roman"/>
           <w:bCs/>
           <w:sz w:val="32"/>
           <w:szCs w:val="32"/>
@@ -1810,7 +1809,7 @@
         <w:ind w:left="720"/>
         <w:jc w:val="both"/>
         <w:rPr>
-          <w:rFonts w:ascii="SimSun" w:hAnsi="SimSun" w:cs="SimSun"/>
+          <w:rFonts w:ascii="Times New Roman" w:hAnsi="Times New Roman" w:cs="Times New Roman"/>
           <w:bCs/>
           <w:sz w:val="32"/>
           <w:szCs w:val="32"/>
@@ -1822,7 +1821,7 @@
         <w:ind w:left="720"/>
         <w:jc w:val="both"/>
         <w:rPr>
-          <w:rFonts w:ascii="SimSun" w:hAnsi="SimSun" w:cs="SimSun"/>
+          <w:rFonts w:ascii="Times New Roman" w:hAnsi="Times New Roman" w:cs="Times New Roman"/>
           <w:bCs/>
           <w:sz w:val="32"/>
           <w:szCs w:val="32"/>
@@ -1834,7 +1833,7 @@
         <w:ind w:left="720"/>
         <w:jc w:val="both"/>
         <w:rPr>
-          <w:rFonts w:ascii="SimSun" w:hAnsi="SimSun" w:cs="SimSun"/>
+          <w:rFonts w:ascii="Times New Roman" w:hAnsi="Times New Roman" w:cs="Times New Roman"/>
           <w:bCs/>
           <w:sz w:val="32"/>
           <w:szCs w:val="32"/>
@@ -1844,7 +1843,7 @@
     <w:p>
       <w:pPr>
         <w:rPr>
-          <w:rFonts w:ascii="Times" w:eastAsia="Times" w:hAnsi="Times" w:cs="Times"/>
+          <w:rFonts w:ascii="Times New Roman" w:eastAsia="Times" w:hAnsi="Times New Roman" w:cs="Times New Roman"/>
           <w:bCs/>
         </w:rPr>
       </w:pPr>
@@ -2213,6 +2212,95 @@
     </w:lvl>
   </w:abstractNum>
   <w:abstractNum w:abstractNumId="3" w15:restartNumberingAfterBreak="0">
+    <w:nsid w:val="0F345ECC"/>
+    <w:multiLevelType w:val="hybridMultilevel"/>
+    <w:tmpl w:val="9B628CAE"/>
+    <w:lvl w:ilvl="0" w:tplc="0809000F">
+      <w:start w:val="1"/>
+      <w:numFmt w:val="decimal"/>
+      <w:lvlText w:val="%1."/>
+      <w:lvlJc w:val="left"/>
+      <w:pPr>
+        <w:ind w:left="720" w:hanging="360"/>
+      </w:pPr>
+      <w:rPr>
+        <w:rFonts w:hint="default"/>
+      </w:rPr>
+    </w:lvl>
+    <w:lvl w:ilvl="1" w:tplc="08090019" w:tentative="1">
+      <w:start w:val="1"/>
+      <w:numFmt w:val="lowerLetter"/>
+      <w:lvlText w:val="%2."/>
+      <w:lvlJc w:val="left"/>
+      <w:pPr>
+        <w:ind w:left="1440" w:hanging="360"/>
+      </w:pPr>
+    </w:lvl>
+    <w:lvl w:ilvl="2" w:tplc="0809001B" w:tentative="1">
+      <w:start w:val="1"/>
+      <w:numFmt w:val="lowerRoman"/>
+      <w:lvlText w:val="%3."/>
+      <w:lvlJc w:val="right"/>
+      <w:pPr>
+        <w:ind w:left="2160" w:hanging="180"/>
+      </w:pPr>
+    </w:lvl>
+    <w:lvl w:ilvl="3" w:tplc="0809000F" w:tentative="1">
+      <w:start w:val="1"/>
+      <w:numFmt w:val="decimal"/>
+      <w:lvlText w:val="%4."/>
+      <w:lvlJc w:val="left"/>
+      <w:pPr>
+        <w:ind w:left="2880" w:hanging="360"/>
+      </w:pPr>
+    </w:lvl>
+    <w:lvl w:ilvl="4" w:tplc="08090019" w:tentative="1">
+      <w:start w:val="1"/>
+      <w:numFmt w:val="lowerLetter"/>
+      <w:lvlText w:val="%5."/>
+      <w:lvlJc w:val="left"/>
+      <w:pPr>
+        <w:ind w:left="3600" w:hanging="360"/>
+      </w:pPr>
+    </w:lvl>
+    <w:lvl w:ilvl="5" w:tplc="0809001B" w:tentative="1">
+      <w:start w:val="1"/>
+      <w:numFmt w:val="lowerRoman"/>
+      <w:lvlText w:val="%6."/>
+      <w:lvlJc w:val="right"/>
+      <w:pPr>
+        <w:ind w:left="4320" w:hanging="180"/>
+      </w:pPr>
+    </w:lvl>
+    <w:lvl w:ilvl="6" w:tplc="0809000F" w:tentative="1">
+      <w:start w:val="1"/>
+      <w:numFmt w:val="decimal"/>
+      <w:lvlText w:val="%7."/>
+      <w:lvlJc w:val="left"/>
+      <w:pPr>
+        <w:ind w:left="5040" w:hanging="360"/>
+      </w:pPr>
+    </w:lvl>
+    <w:lvl w:ilvl="7" w:tplc="08090019" w:tentative="1">
+      <w:start w:val="1"/>
+      <w:numFmt w:val="lowerLetter"/>
+      <w:lvlText w:val="%8."/>
+      <w:lvlJc w:val="left"/>
+      <w:pPr>
+        <w:ind w:left="5760" w:hanging="360"/>
+      </w:pPr>
+    </w:lvl>
+    <w:lvl w:ilvl="8" w:tplc="0809001B" w:tentative="1">
+      <w:start w:val="1"/>
+      <w:numFmt w:val="lowerRoman"/>
+      <w:lvlText w:val="%9."/>
+      <w:lvlJc w:val="right"/>
+      <w:pPr>
+        <w:ind w:left="6480" w:hanging="180"/>
+      </w:pPr>
+    </w:lvl>
+  </w:abstractNum>
+  <w:abstractNum w:abstractNumId="4" w15:restartNumberingAfterBreak="0">
     <w:nsid w:val="1F5E0E2E"/>
     <w:multiLevelType w:val="hybridMultilevel"/>
     <w:tmpl w:val="E18AF45E"/>
@@ -2301,7 +2389,96 @@
       </w:pPr>
     </w:lvl>
   </w:abstractNum>
-  <w:abstractNum w:abstractNumId="4" w15:restartNumberingAfterBreak="0">
+  <w:abstractNum w:abstractNumId="5" w15:restartNumberingAfterBreak="0">
+    <w:nsid w:val="2BE81E61"/>
+    <w:multiLevelType w:val="hybridMultilevel"/>
+    <w:tmpl w:val="3E164D00"/>
+    <w:lvl w:ilvl="0" w:tplc="0809000F">
+      <w:start w:val="1"/>
+      <w:numFmt w:val="decimal"/>
+      <w:lvlText w:val="%1."/>
+      <w:lvlJc w:val="left"/>
+      <w:pPr>
+        <w:ind w:left="720" w:hanging="360"/>
+      </w:pPr>
+      <w:rPr>
+        <w:rFonts w:hint="default"/>
+      </w:rPr>
+    </w:lvl>
+    <w:lvl w:ilvl="1" w:tplc="08090019" w:tentative="1">
+      <w:start w:val="1"/>
+      <w:numFmt w:val="lowerLetter"/>
+      <w:lvlText w:val="%2."/>
+      <w:lvlJc w:val="left"/>
+      <w:pPr>
+        <w:ind w:left="1440" w:hanging="360"/>
+      </w:pPr>
+    </w:lvl>
+    <w:lvl w:ilvl="2" w:tplc="0809001B" w:tentative="1">
+      <w:start w:val="1"/>
+      <w:numFmt w:val="lowerRoman"/>
+      <w:lvlText w:val="%3."/>
+      <w:lvlJc w:val="right"/>
+      <w:pPr>
+        <w:ind w:left="2160" w:hanging="180"/>
+      </w:pPr>
+    </w:lvl>
+    <w:lvl w:ilvl="3" w:tplc="0809000F" w:tentative="1">
+      <w:start w:val="1"/>
+      <w:numFmt w:val="decimal"/>
+      <w:lvlText w:val="%4."/>
+      <w:lvlJc w:val="left"/>
+      <w:pPr>
+        <w:ind w:left="2880" w:hanging="360"/>
+      </w:pPr>
+    </w:lvl>
+    <w:lvl w:ilvl="4" w:tplc="08090019" w:tentative="1">
+      <w:start w:val="1"/>
+      <w:numFmt w:val="lowerLetter"/>
+      <w:lvlText w:val="%5."/>
+      <w:lvlJc w:val="left"/>
+      <w:pPr>
+        <w:ind w:left="3600" w:hanging="360"/>
+      </w:pPr>
+    </w:lvl>
+    <w:lvl w:ilvl="5" w:tplc="0809001B" w:tentative="1">
+      <w:start w:val="1"/>
+      <w:numFmt w:val="lowerRoman"/>
+      <w:lvlText w:val="%6."/>
+      <w:lvlJc w:val="right"/>
+      <w:pPr>
+        <w:ind w:left="4320" w:hanging="180"/>
+      </w:pPr>
+    </w:lvl>
+    <w:lvl w:ilvl="6" w:tplc="0809000F" w:tentative="1">
+      <w:start w:val="1"/>
+      <w:numFmt w:val="decimal"/>
+      <w:lvlText w:val="%7."/>
+      <w:lvlJc w:val="left"/>
+      <w:pPr>
+        <w:ind w:left="5040" w:hanging="360"/>
+      </w:pPr>
+    </w:lvl>
+    <w:lvl w:ilvl="7" w:tplc="08090019" w:tentative="1">
+      <w:start w:val="1"/>
+      <w:numFmt w:val="lowerLetter"/>
+      <w:lvlText w:val="%8."/>
+      <w:lvlJc w:val="left"/>
+      <w:pPr>
+        <w:ind w:left="5760" w:hanging="360"/>
+      </w:pPr>
+    </w:lvl>
+    <w:lvl w:ilvl="8" w:tplc="0809001B" w:tentative="1">
+      <w:start w:val="1"/>
+      <w:numFmt w:val="lowerRoman"/>
+      <w:lvlText w:val="%9."/>
+      <w:lvlJc w:val="right"/>
+      <w:pPr>
+        <w:ind w:left="6480" w:hanging="180"/>
+      </w:pPr>
+    </w:lvl>
+  </w:abstractNum>
+  <w:abstractNum w:abstractNumId="6" w15:restartNumberingAfterBreak="0">
     <w:nsid w:val="3901232A"/>
     <w:multiLevelType w:val="hybridMultilevel"/>
     <w:tmpl w:val="8B10654C"/>
@@ -2414,7 +2591,7 @@
       </w:rPr>
     </w:lvl>
   </w:abstractNum>
-  <w:abstractNum w:abstractNumId="5" w15:restartNumberingAfterBreak="0">
+  <w:abstractNum w:abstractNumId="7" w15:restartNumberingAfterBreak="0">
     <w:nsid w:val="67777F70"/>
     <w:multiLevelType w:val="hybridMultilevel"/>
     <w:tmpl w:val="783409B0"/>
@@ -2507,10 +2684,10 @@
     <w:abstractNumId w:val="0"/>
   </w:num>
   <w:num w:numId="2" w16cid:durableId="625282580">
-    <w:abstractNumId w:val="3"/>
+    <w:abstractNumId w:val="4"/>
   </w:num>
   <w:num w:numId="3" w16cid:durableId="75783613">
-    <w:abstractNumId w:val="4"/>
+    <w:abstractNumId w:val="6"/>
   </w:num>
   <w:num w:numId="4" w16cid:durableId="1057169024">
     <w:abstractNumId w:val="2"/>
@@ -2519,7 +2696,13 @@
     <w:abstractNumId w:val="1"/>
   </w:num>
   <w:num w:numId="6" w16cid:durableId="2099012512">
+    <w:abstractNumId w:val="7"/>
+  </w:num>
+  <w:num w:numId="7" w16cid:durableId="1575972778">
     <w:abstractNumId w:val="5"/>
+  </w:num>
+  <w:num w:numId="8" w16cid:durableId="1359165538">
+    <w:abstractNumId w:val="3"/>
   </w:num>
 </w:numbering>
 </file>
@@ -3036,7 +3219,6 @@
   <w:style w:type="character" w:default="1" w:styleId="DefaultParagraphFont">
     <w:name w:val="Default Paragraph Font"/>
     <w:uiPriority w:val="1"/>
-    <w:semiHidden/>
     <w:unhideWhenUsed/>
   </w:style>
   <w:style w:type="table" w:default="1" w:styleId="TableNormal">

</xml_diff>